<commit_message>
Documents PDF/Word régénérés, plan de déploiement HA inclus
Co-Authored-By: Claude Opus 5.5 <noreply@anthropic.com>
Claude-Session: https://claude.ai/code/session_014Nnx55juzv7J6Z4kH5PphN
</commit_message>
<xml_diff>
--- a/wawid/docs/guides/WawID-Guide-installation-Senegal.docx
+++ b/wawid/docs/guides/WawID-Guide-installation-Senegal.docx
@@ -57,7 +57,23 @@
         <w:pStyle w:val="BodyText"/>
       </w:pPr>
       <w:r>
-        <w:t xml:space="preserve">Pour les détails techniques déjà documentés, ce guide renvoie aux pages</w:t>
+        <w:t xml:space="preserve">L'infrastructure d'hébergement haute disponibilité (deux centres de données actifs au Sénégal et un site de sauvegarde), la stratégie de sauvegarde, les procédures de bascule et le phasage détaillé font l'objet de la page</w:t>
+      </w:r>
+      <w:r>
+        <w:t xml:space="preserve"> </w:t>
+      </w:r>
+      <w:r>
+        <w:rPr>
+          <w:iCs/>
+          <w:i/>
+        </w:rPr>
+        <w:t xml:space="preserve">Plan de déploiement — infrastructure haute disponibilité au Sénégal</w:t>
+      </w:r>
+      <w:r>
+        <w:t xml:space="preserve"> </w:t>
+      </w:r>
+      <w:r>
+        <w:t xml:space="preserve">; ce guide en reprend l'essentiel. Pour les autres détails techniques déjà documentés, il renvoie aux pages</w:t>
       </w:r>
       <w:r>
         <w:t xml:space="preserve"> </w:t>
@@ -324,7 +340,7 @@
         <w:t xml:space="preserve"> </w:t>
       </w:r>
       <w:r>
-        <w:t xml:space="preserve">hébergé sur Netlify (Netlify Functions et Netlify Blobs). Il valide les parcours (guichet, eGate, e-Visa, WawPass, APIS/PNR, renseignement, redevance), pas la charge, la souveraineté ni la continuité de service. Une exploitation nationale exige l'architecture souveraine décrite dans</w:t>
+        <w:t xml:space="preserve">hébergé sur Netlify (Netlify Functions et Netlify Blobs). Il valide les parcours (guichet, eGate, e-Visa, pré-enrôlement eGate, APIS/PNR, renseignement, redevance), pas la charge, la souveraineté ni la continuité de service. Une exploitation nationale exige l'architecture souveraine décrite dans</w:t>
       </w:r>
       <w:r>
         <w:t xml:space="preserve"> </w:t>
@@ -425,7 +441,45 @@
               <w:jc w:val="left"/>
             </w:pPr>
             <w:r>
-              <w:t xml:space="preserve">Centre de données national + site de secours au Sénégal (À développer)</w:t>
+              <w:t xml:space="preserve">Deux centres de données actifs au Sénégal (site A : Datacenter national de Diamniadio ; site B : centre commercial certifié Tier III) + site C de sauvegarde (À développer)</w:t>
+            </w:r>
+          </w:p>
+        </w:tc>
+      </w:tr>
+      <w:tr>
+        <w:tc>
+          <w:tcPr/>
+          <w:p>
+            <w:pPr>
+              <w:pStyle w:val="Compact"/>
+              <w:jc w:val="left"/>
+            </w:pPr>
+            <w:r>
+              <w:t xml:space="preserve">Sauvegardes</w:t>
+            </w:r>
+          </w:p>
+        </w:tc>
+        <w:tc>
+          <w:tcPr/>
+          <w:p>
+            <w:pPr>
+              <w:pStyle w:val="Compact"/>
+              <w:jc w:val="left"/>
+            </w:pPr>
+            <w:r>
+              <w:t xml:space="preserve">Aucune sauvegarde dédiée</w:t>
+            </w:r>
+          </w:p>
+        </w:tc>
+        <w:tc>
+          <w:tcPr/>
+          <w:p>
+            <w:pPr>
+              <w:pStyle w:val="Compact"/>
+              <w:jc w:val="left"/>
+            </w:pPr>
+            <w:r>
+              <w:t xml:space="preserve">Règle 3-2-1-1-0, copies immuables et hors ligne au site C, restauration testée chaque trimestre (À développer)</w:t>
             </w:r>
           </w:p>
         </w:tc>
@@ -1287,7 +1341,23 @@
         <w:t xml:space="preserve">Recommandation</w:t>
       </w:r>
       <w:r>
-        <w:t xml:space="preserve">. Il reprend le principe de la note de proposition (</w:t>
+        <w:t xml:space="preserve"> </w:t>
+      </w:r>
+      <w:r>
+        <w:t xml:space="preserve">; il reprend celui de la page</w:t>
+      </w:r>
+      <w:r>
+        <w:t xml:space="preserve"> </w:t>
+      </w:r>
+      <w:r>
+        <w:rPr>
+          <w:iCs/>
+          <w:i/>
+        </w:rPr>
+        <w:t xml:space="preserve">Plan de déploiement — infrastructure haute disponibilité au Sénégal</w:t>
+      </w:r>
+      <w:r>
+        <w:t xml:space="preserve">, qui détaille les critères d'entrée et de sortie et les tests de réception. Il suit le principe de la note de proposition (</w:t>
       </w:r>
       <w:r>
         <w:rPr>
@@ -1296,7 +1366,7 @@
         <w:t xml:space="preserve">docs/PROPOSITION-REMPLACEMENT-SECURIPORT.md</w:t>
       </w:r>
       <w:r>
-        <w:t xml:space="preserve">) : pilote à l'AIBD en parallèle du système en place, puis bascule par vagues, sans interruption du contrôle. Les durées indiquées dans cette note sont indicatives ; aucun calendrier n'est arrêté.</w:t>
+        <w:t xml:space="preserve">) : pilote à l'AIBD en parallèle du système en place, puis bascule par vagues, sans interruption du contrôle. Il ajoute la construction de l'infrastructure haute disponibilité et la migration de l'application, que la note ne comprenait pas. Aucun calendrier n'est arrêté ; les durées du plan sont indicatives.</w:t>
       </w:r>
     </w:p>
     <w:tbl>
@@ -1374,250 +1444,315 @@
               <w:jc w:val="left"/>
             </w:pPr>
             <w:r>
-              <w:t xml:space="preserve">0. Cadrage</w:t>
-            </w:r>
-          </w:p>
-        </w:tc>
-        <w:tc>
-          <w:tcPr/>
-          <w:p>
-            <w:pPr>
-              <w:pStyle w:val="Compact"/>
-              <w:jc w:val="left"/>
-            </w:pPr>
-            <w:r>
-              <w:t xml:space="preserve">Juridique, contractuel, hébergement</w:t>
-            </w:r>
-          </w:p>
-        </w:tc>
-        <w:tc>
-          <w:tcPr/>
-          <w:p>
-            <w:pPr>
-              <w:pStyle w:val="Compact"/>
-              <w:jc w:val="left"/>
-            </w:pPr>
-            <w:r>
-              <w:t xml:space="preserve">Points « À vérifier » ci-dessous traités ; choix de l'hébergement</w:t>
-            </w:r>
-          </w:p>
-        </w:tc>
-        <w:tc>
-          <w:tcPr/>
-          <w:p>
-            <w:pPr>
-              <w:pStyle w:val="Compact"/>
-              <w:jc w:val="left"/>
-            </w:pPr>
-            <w:r>
-              <w:t xml:space="preserve">Décision écrite des autorités compétentes</w:t>
-            </w:r>
-          </w:p>
-        </w:tc>
-      </w:tr>
-      <w:tr>
-        <w:tc>
-          <w:tcPr/>
-          <w:p>
-            <w:pPr>
-              <w:pStyle w:val="Compact"/>
-              <w:jc w:val="left"/>
-            </w:pPr>
-            <w:r>
-              <w:t xml:space="preserve">1. Pilote</w:t>
-            </w:r>
-          </w:p>
-        </w:tc>
-        <w:tc>
-          <w:tcPr/>
-          <w:p>
-            <w:pPr>
-              <w:pStyle w:val="Compact"/>
-              <w:jc w:val="left"/>
-            </w:pPr>
-            <w:r>
-              <w:t xml:space="preserve">AIBD : quelques guichets et eGates aux arrivées et aux départs, en parallèle du système en place ; passerelle API/PNR ouverte à des compagnies volontaires ; rapprochement de la redevance</w:t>
-            </w:r>
-          </w:p>
-        </w:tc>
-        <w:tc>
-          <w:tcPr/>
-          <w:p>
-            <w:pPr>
-              <w:pStyle w:val="Compact"/>
-              <w:jc w:val="left"/>
-            </w:pPr>
-            <w:r>
-              <w:t xml:space="preserve">Hébergement national opérationnel ; lecteurs et SDK certifiés intégrés ; agents pilotes formés</w:t>
-            </w:r>
-          </w:p>
-        </w:tc>
-        <w:tc>
-          <w:tcPr/>
-          <w:p>
-            <w:pPr>
-              <w:pStyle w:val="Compact"/>
-              <w:jc w:val="left"/>
-            </w:pPr>
-            <w:r>
-              <w:t xml:space="preserve">Recette du pilote validée (voir le tableau de recette) ; aucun incident bloquant sur une période d'observation convenue</w:t>
-            </w:r>
-          </w:p>
-        </w:tc>
-      </w:tr>
-      <w:tr>
-        <w:tc>
-          <w:tcPr/>
-          <w:p>
-            <w:pPr>
-              <w:pStyle w:val="Compact"/>
-              <w:jc w:val="left"/>
-            </w:pPr>
-            <w:r>
-              <w:t xml:space="preserve">2. Vague aérienne et maritime</w:t>
-            </w:r>
-          </w:p>
-        </w:tc>
-        <w:tc>
-          <w:tcPr/>
-          <w:p>
-            <w:pPr>
-              <w:pStyle w:val="Compact"/>
-              <w:jc w:val="left"/>
-            </w:pPr>
-            <w:r>
-              <w:t xml:space="preserve">AIBD complet, Aéroport de Ziguinchor, Port Autonome de Dakar</w:t>
-            </w:r>
-          </w:p>
-        </w:tc>
-        <w:tc>
-          <w:tcPr/>
-          <w:p>
-            <w:pPr>
-              <w:pStyle w:val="Compact"/>
-              <w:jc w:val="left"/>
-            </w:pPr>
-            <w:r>
-              <w:t xml:space="preserve">Bilan du pilote ; serveurs de poste installés ; liaisons réseau validées</w:t>
-            </w:r>
-          </w:p>
-        </w:tc>
-        <w:tc>
-          <w:tcPr/>
-          <w:p>
-            <w:pPr>
-              <w:pStyle w:val="Compact"/>
-              <w:jc w:val="left"/>
-            </w:pPr>
-            <w:r>
-              <w:t xml:space="preserve">Recette par poste</w:t>
-            </w:r>
-          </w:p>
-        </w:tc>
-      </w:tr>
-      <w:tr>
-        <w:tc>
-          <w:tcPr/>
-          <w:p>
-            <w:pPr>
-              <w:pStyle w:val="Compact"/>
-              <w:jc w:val="left"/>
-            </w:pPr>
-            <w:r>
-              <w:t xml:space="preserve">3. Vague terrestre</w:t>
-            </w:r>
-          </w:p>
-        </w:tc>
-        <w:tc>
-          <w:tcPr/>
-          <w:p>
-            <w:pPr>
-              <w:pStyle w:val="Compact"/>
-              <w:jc w:val="left"/>
-            </w:pPr>
-            <w:r>
-              <w:t xml:space="preserve">Rosso, Kidira, Karang (lecteurs de plaques VRS, scanners)</w:t>
-            </w:r>
-          </w:p>
-        </w:tc>
-        <w:tc>
-          <w:tcPr/>
-          <w:p>
-            <w:pPr>
-              <w:pStyle w:val="Compact"/>
-              <w:jc w:val="left"/>
-            </w:pPr>
-            <w:r>
-              <w:t xml:space="preserve">Mode hors ligne validé ; secours 4G/VSAT en place</w:t>
-            </w:r>
-          </w:p>
-        </w:tc>
-        <w:tc>
-          <w:tcPr/>
-          <w:p>
-            <w:pPr>
-              <w:pStyle w:val="Compact"/>
-              <w:jc w:val="left"/>
-            </w:pPr>
-            <w:r>
-              <w:t xml:space="preserve">Recette par poste, dont un essai de coupure de liaison</w:t>
-            </w:r>
-          </w:p>
-        </w:tc>
-      </w:tr>
-      <w:tr>
-        <w:tc>
-          <w:tcPr/>
-          <w:p>
-            <w:pPr>
-              <w:pStyle w:val="Compact"/>
-              <w:jc w:val="left"/>
-            </w:pPr>
-            <w:r>
-              <w:t xml:space="preserve">4. Généralisation</w:t>
-            </w:r>
-          </w:p>
-        </w:tc>
-        <w:tc>
-          <w:tcPr/>
-          <w:p>
-            <w:pPr>
-              <w:pStyle w:val="Compact"/>
-              <w:jc w:val="left"/>
-            </w:pPr>
-            <w:r>
-              <w:t xml:space="preserve">Autres postes à déclarer, arrêt du système précédent</w:t>
-            </w:r>
-          </w:p>
-        </w:tc>
-        <w:tc>
-          <w:tcPr/>
-          <w:p>
-            <w:pPr>
-              <w:pStyle w:val="Compact"/>
-              <w:jc w:val="left"/>
-            </w:pPr>
-            <w:r>
-              <w:t xml:space="preserve">Reprise des données selon les clauses contractuelles applicables</w:t>
-            </w:r>
-          </w:p>
-        </w:tc>
-        <w:tc>
-          <w:tcPr/>
-          <w:p>
-            <w:pPr>
-              <w:pStyle w:val="Compact"/>
-              <w:jc w:val="left"/>
-            </w:pPr>
-            <w:r>
-              <w:t xml:space="preserve">Procès-verbal de mise en service définitive</w:t>
+              <w:t xml:space="preserve">0. Cadrage et juridique</w:t>
+            </w:r>
+          </w:p>
+        </w:tc>
+        <w:tc>
+          <w:tcPr/>
+          <w:p>
+            <w:pPr>
+              <w:pStyle w:val="Compact"/>
+              <w:jc w:val="left"/>
+            </w:pPr>
+            <w:r>
+              <w:t xml:space="preserve">Contrat, formalités CDP, conventions avec Sénégal Numérique (site A) et le centre de données commercial (site B), choix du site C, mandat d'encaissement de la redevance si le circuit</w:t>
+            </w:r>
+            <w:r>
+              <w:t xml:space="preserve"> </w:t>
+            </w:r>
+            <w:r>
+              <w:rPr>
+                <w:rStyle w:val="VerbatimChar"/>
+              </w:rPr>
+              <w:t xml:space="preserve">OPERATEUR</w:t>
+            </w:r>
+            <w:r>
+              <w:t xml:space="preserve"> </w:t>
+            </w:r>
+            <w:r>
+              <w:t xml:space="preserve">est retenu</w:t>
+            </w:r>
+          </w:p>
+        </w:tc>
+        <w:tc>
+          <w:tcPr/>
+          <w:p>
+            <w:pPr>
+              <w:pStyle w:val="Compact"/>
+              <w:jc w:val="left"/>
+            </w:pPr>
+            <w:r>
+              <w:t xml:space="preserve">Points « À vérifier » ci-dessous traités</w:t>
+            </w:r>
+          </w:p>
+        </w:tc>
+        <w:tc>
+          <w:tcPr/>
+          <w:p>
+            <w:pPr>
+              <w:pStyle w:val="Compact"/>
+              <w:jc w:val="left"/>
+            </w:pPr>
+            <w:r>
+              <w:t xml:space="preserve">Conventions signées ; décision écrite des autorités compétentes</w:t>
+            </w:r>
+          </w:p>
+        </w:tc>
+      </w:tr>
+      <w:tr>
+        <w:tc>
+          <w:tcPr/>
+          <w:p>
+            <w:pPr>
+              <w:pStyle w:val="Compact"/>
+              <w:jc w:val="left"/>
+            </w:pPr>
+            <w:r>
+              <w:t xml:space="preserve">1. Construction des sites A, B et C</w:t>
+            </w:r>
+          </w:p>
+        </w:tc>
+        <w:tc>
+          <w:tcPr/>
+          <w:p>
+            <w:pPr>
+              <w:pStyle w:val="Compact"/>
+              <w:jc w:val="left"/>
+            </w:pPr>
+            <w:r>
+              <w:t xml:space="preserve">Énergie, baies, réseau, liaisons entre sites, HSM, plateforme d'exécution, base de données, stockage objet, sauvegardes, supervision et SOC</w:t>
+            </w:r>
+          </w:p>
+        </w:tc>
+        <w:tc>
+          <w:tcPr/>
+          <w:p>
+            <w:pPr>
+              <w:pStyle w:val="Compact"/>
+              <w:jc w:val="left"/>
+            </w:pPr>
+            <w:r>
+              <w:t xml:space="preserve">Phase 0 terminée ; matériel livré</w:t>
+            </w:r>
+          </w:p>
+        </w:tc>
+        <w:tc>
+          <w:tcPr/>
+          <w:p>
+            <w:pPr>
+              <w:pStyle w:val="Compact"/>
+              <w:jc w:val="left"/>
+            </w:pPr>
+            <w:r>
+              <w:t xml:space="preserve">Bascule A → B et restauration depuis le site C réussies</w:t>
+            </w:r>
+          </w:p>
+        </w:tc>
+      </w:tr>
+      <w:tr>
+        <w:tc>
+          <w:tcPr/>
+          <w:p>
+            <w:pPr>
+              <w:pStyle w:val="Compact"/>
+              <w:jc w:val="left"/>
+            </w:pPr>
+            <w:r>
+              <w:t xml:space="preserve">2. Migration de l'application</w:t>
+            </w:r>
+          </w:p>
+        </w:tc>
+        <w:tc>
+          <w:tcPr/>
+          <w:p>
+            <w:pPr>
+              <w:pStyle w:val="Compact"/>
+              <w:jc w:val="left"/>
+            </w:pPr>
+            <w:r>
+              <w:t xml:space="preserve">Passage du démonstrateur Netlify à la pile souveraine (API conteneurisée, PostgreSQL et stockage objet, secrets en HSM, un domaine par plateforme), en parallèle de la phase 1</w:t>
+            </w:r>
+          </w:p>
+        </w:tc>
+        <w:tc>
+          <w:tcPr/>
+          <w:p>
+            <w:pPr>
+              <w:pStyle w:val="Compact"/>
+              <w:jc w:val="left"/>
+            </w:pPr>
+            <w:r>
+              <w:t xml:space="preserve">Développements prioritaires lancés</w:t>
+            </w:r>
+          </w:p>
+        </w:tc>
+        <w:tc>
+          <w:tcPr/>
+          <w:p>
+            <w:pPr>
+              <w:pStyle w:val="Compact"/>
+              <w:jc w:val="left"/>
+            </w:pPr>
+            <w:r>
+              <w:t xml:space="preserve">Recette fonctionnelle en préproduction ; test de charge ; test d'intrusion</w:t>
+            </w:r>
+          </w:p>
+        </w:tc>
+      </w:tr>
+      <w:tr>
+        <w:tc>
+          <w:tcPr/>
+          <w:p>
+            <w:pPr>
+              <w:pStyle w:val="Compact"/>
+              <w:jc w:val="left"/>
+            </w:pPr>
+            <w:r>
+              <w:t xml:space="preserve">3. Pilote</w:t>
+            </w:r>
+          </w:p>
+        </w:tc>
+        <w:tc>
+          <w:tcPr/>
+          <w:p>
+            <w:pPr>
+              <w:pStyle w:val="Compact"/>
+              <w:jc w:val="left"/>
+            </w:pPr>
+            <w:r>
+              <w:t xml:space="preserve">AIBD : quelques guichets et eGates aux arrivées et aux départs, en parallèle du système en place ; serveur de poste de l'AIBD ; passerelle API/PNR ouverte à des compagnies volontaires ; rapprochement de la redevance</w:t>
+            </w:r>
+          </w:p>
+        </w:tc>
+        <w:tc>
+          <w:tcPr/>
+          <w:p>
+            <w:pPr>
+              <w:pStyle w:val="Compact"/>
+              <w:jc w:val="left"/>
+            </w:pPr>
+            <w:r>
+              <w:t xml:space="preserve">Phases 1 et 2 validées ; formalités CDP accomplies ; lecteurs et SDK certifiés intégrés ; agents pilotes formés</w:t>
+            </w:r>
+          </w:p>
+        </w:tc>
+        <w:tc>
+          <w:tcPr/>
+          <w:p>
+            <w:pPr>
+              <w:pStyle w:val="Compact"/>
+              <w:jc w:val="left"/>
+            </w:pPr>
+            <w:r>
+              <w:t xml:space="preserve">Recette du pilote validée (voir le tableau de recette) ; aucun incident bloquant sur une période d'observation convenue ; exercice de bascule réussi</w:t>
+            </w:r>
+          </w:p>
+        </w:tc>
+      </w:tr>
+      <w:tr>
+        <w:tc>
+          <w:tcPr/>
+          <w:p>
+            <w:pPr>
+              <w:pStyle w:val="Compact"/>
+              <w:jc w:val="left"/>
+            </w:pPr>
+            <w:r>
+              <w:t xml:space="preserve">4. Généralisation par vagues</w:t>
+            </w:r>
+          </w:p>
+        </w:tc>
+        <w:tc>
+          <w:tcPr/>
+          <w:p>
+            <w:pPr>
+              <w:pStyle w:val="Compact"/>
+              <w:jc w:val="left"/>
+            </w:pPr>
+            <w:r>
+              <w:t xml:space="preserve">Vague 1 : AIBD complet, Aéroport de Ziguinchor, Port Autonome de Dakar. Vague 2 : Rosso, Kidira, Karang (lecteurs de plaques VRS, scanners) ; arrêt du système précédent</w:t>
+            </w:r>
+          </w:p>
+        </w:tc>
+        <w:tc>
+          <w:tcPr/>
+          <w:p>
+            <w:pPr>
+              <w:pStyle w:val="Compact"/>
+              <w:jc w:val="left"/>
+            </w:pPr>
+            <w:r>
+              <w:t xml:space="preserve">Bilan du pilote ; serveurs de poste installés ; liaisons principale et de secours validées ; mode hors ligne validé pour la vague 2</w:t>
+            </w:r>
+          </w:p>
+        </w:tc>
+        <w:tc>
+          <w:tcPr/>
+          <w:p>
+            <w:pPr>
+              <w:pStyle w:val="Compact"/>
+              <w:jc w:val="left"/>
+            </w:pPr>
+            <w:r>
+              <w:t xml:space="preserve">Recette par poste, dont un essai de coupure de liaison ; reprise des données selon les clauses contractuelles ; procès-verbal de mise en service définitive</w:t>
+            </w:r>
+          </w:p>
+        </w:tc>
+      </w:tr>
+      <w:tr>
+        <w:tc>
+          <w:tcPr/>
+          <w:p>
+            <w:pPr>
+              <w:pStyle w:val="Compact"/>
+              <w:jc w:val="left"/>
+            </w:pPr>
+            <w:r>
+              <w:t xml:space="preserve">5. Exploitation</w:t>
+            </w:r>
+          </w:p>
+        </w:tc>
+        <w:tc>
+          <w:tcPr/>
+          <w:p>
+            <w:pPr>
+              <w:pStyle w:val="Compact"/>
+              <w:jc w:val="left"/>
+            </w:pPr>
+            <w:r>
+              <w:t xml:space="preserve">Supervision 24 h/24, maintenance, exercices de reprise deux fois par an, restauration trimestrielle</w:t>
+            </w:r>
+          </w:p>
+        </w:tc>
+        <w:tc>
+          <w:tcPr/>
+          <w:p>
+            <w:pPr>
+              <w:pStyle w:val="Compact"/>
+              <w:jc w:val="left"/>
+            </w:pPr>
+            <w:r>
+              <w:t xml:space="preserve">Procès-verbal de mise en service</w:t>
+            </w:r>
+          </w:p>
+        </w:tc>
+        <w:tc>
+          <w:tcPr/>
+          <w:p>
+            <w:pPr>
+              <w:pStyle w:val="Compact"/>
+              <w:jc w:val="left"/>
+            </w:pPr>
+            <w:r>
+              <w:t xml:space="preserve">Revue annuelle</w:t>
             </w:r>
           </w:p>
         </w:tc>
       </w:tr>
     </w:tbl>
     <w:bookmarkEnd w:id="22"/>
-    <w:bookmarkStart w:id="28" w:name="hébergement-au-sénégal"/>
+    <w:bookmarkStart w:id="29" w:name="hébergement-au-sénégal"/>
     <w:p>
       <w:pPr>
         <w:pStyle w:val="Heading2"/>
@@ -1654,7 +1789,7 @@
         <w:t xml:space="preserve"> </w:t>
       </w:r>
       <w:r>
-        <w:t xml:space="preserve">: les données nominatives et biométriques sont hébergées sur le territoire national ; aucune donnée biométrique ne quitte le pays. L'hébergement actuel sur Netlify n'est pas acceptable pour des données réelles (voir</w:t>
+        <w:t xml:space="preserve">: les données nominatives et biométriques, ainsi que les clés qui les protègent, sont hébergées sur le territoire national ; aucune donnée personnelle n'est confiée à un cloud étranger. L'hébergement actuel sur Netlify n'est pas acceptable pour des données réelles (voir</w:t>
       </w:r>
       <w:r>
         <w:t xml:space="preserve"> </w:t>
@@ -1683,44 +1818,13 @@
           <w:bCs/>
           <w:b/>
         </w:rPr>
-        <w:t xml:space="preserve">Centre de données principal</w:t>
-      </w:r>
-      <w:r>
-        <w:t xml:space="preserve"> </w:t>
-      </w:r>
-      <w:r>
-        <w:t xml:space="preserve">:</w:t>
-      </w:r>
-      <w:r>
-        <w:t xml:space="preserve"> </w:t>
-      </w:r>
-      <w:r>
-        <w:rPr>
-          <w:rStyle w:val="VerbatimChar"/>
-        </w:rPr>
-        <w:t xml:space="preserve">docs/ARCHITECTURE.md</w:t>
-      </w:r>
-      <w:r>
-        <w:t xml:space="preserve"> </w:t>
-      </w:r>
-      <w:r>
-        <w:t xml:space="preserve">cite à titre d'exemple le centre de données national de Diamniadio, exploité pour le compte de l'État. Cette option est</w:t>
-      </w:r>
-      <w:r>
-        <w:t xml:space="preserve"> </w:t>
-      </w:r>
-      <w:r>
-        <w:rPr>
-          <w:bCs/>
-          <w:b/>
-        </w:rPr>
-        <w:t xml:space="preserve">À vérifier</w:t>
-      </w:r>
-      <w:r>
-        <w:t xml:space="preserve"> </w:t>
-      </w:r>
-      <w:r>
-        <w:t xml:space="preserve">: disponibilité de capacité, conditions d'hébergement, niveaux de service, sécurité physique et cadre conventionnel doivent être confirmés par l'opérateur du centre et par l'autorité de tutelle. Aucun engagement n'existe à ce jour.</w:t>
+        <w:t xml:space="preserve">Deux centres de données actifs</w:t>
+      </w:r>
+      <w:r>
+        <w:t xml:space="preserve"> </w:t>
+      </w:r>
+      <w:r>
+        <w:t xml:space="preserve">(Recommandation) : les services web et API fonctionnent simultanément dans les deux sites ; la base de données est répliquée de manière synchrone du site A vers le site B ; chaque site peut porter seul toute la charge de pointe.</w:t>
       </w:r>
     </w:p>
     <w:p>
@@ -1736,25 +1840,13 @@
           <w:bCs/>
           <w:b/>
         </w:rPr>
-        <w:t xml:space="preserve">Site de secours</w:t>
-      </w:r>
-      <w:r>
-        <w:t xml:space="preserve"> </w:t>
-      </w:r>
-      <w:r>
-        <w:t xml:space="preserve">: un second site sur le territoire, avec la même pile logicielle (Recommandation de</w:t>
-      </w:r>
-      <w:r>
-        <w:t xml:space="preserve"> </w:t>
-      </w:r>
-      <w:r>
-        <w:rPr>
-          <w:rStyle w:val="VerbatimChar"/>
-        </w:rPr>
-        <w:t xml:space="preserve">docs/ARCHITECTURE.md</w:t>
-      </w:r>
-      <w:r>
-        <w:t xml:space="preserve">).</w:t>
+        <w:t xml:space="preserve">Un site de sauvegarde (site C)</w:t>
+      </w:r>
+      <w:r>
+        <w:t xml:space="preserve"> </w:t>
+      </w:r>
+      <w:r>
+        <w:t xml:space="preserve">: il reçoit des copies chiffrées immuables et des copies hors ligne, sans héberger de production.</w:t>
       </w:r>
     </w:p>
     <w:p>
@@ -1785,7 +1877,7 @@
         <w:t xml:space="preserve">/compagnies/</w:t>
       </w:r>
       <w:r>
-        <w:t xml:space="preserve">) et la passerelle transporteurs sont exposés sur Internet, en DMZ derrière un CDN/WAF anti-DDoS ; l'espace DPAF (</w:t>
+        <w:t xml:space="preserve">) et la passerelle transporteurs sont exposés sur Internet, derrière un WAF et une protection anti-DDoS ; l'espace DPAF (</w:t>
       </w:r>
       <w:r>
         <w:rPr>
@@ -1794,11 +1886,362 @@
         <w:t xml:space="preserve">/dpaf/</w:t>
       </w:r>
       <w:r>
-        <w:t xml:space="preserve">), les kiosques et les services internes restent sur le réseau privé. Chaque plateforme peut recevoir son propre nom de domaine.</w:t>
+        <w:t xml:space="preserve">), les kiosques et les services internes restent sur le réseau privé. Chaque plateforme reçoit son propre nom de domaine (par exemple</w:t>
+      </w:r>
+      <w:r>
+        <w:t xml:space="preserve"> </w:t>
+      </w:r>
+      <w:r>
+        <w:rPr>
+          <w:rStyle w:val="VerbatimChar"/>
+        </w:rPr>
+        <w:t xml:space="preserve">dpaf.&lt;domaine&gt;</w:t>
+      </w:r>
+      <w:r>
+        <w:t xml:space="preserve">,</w:t>
+      </w:r>
+      <w:r>
+        <w:t xml:space="preserve"> </w:t>
+      </w:r>
+      <w:r>
+        <w:rPr>
+          <w:rStyle w:val="VerbatimChar"/>
+        </w:rPr>
+        <w:t xml:space="preserve">www.&lt;domaine&gt;</w:t>
+      </w:r>
+      <w:r>
+        <w:t xml:space="preserve">,</w:t>
+      </w:r>
+      <w:r>
+        <w:t xml:space="preserve"> </w:t>
+      </w:r>
+      <w:r>
+        <w:rPr>
+          <w:rStyle w:val="VerbatimChar"/>
+        </w:rPr>
+        <w:t xml:space="preserve">compagnies.&lt;domaine&gt;</w:t>
+      </w:r>
+      <w:r>
+        <w:t xml:space="preserve">,</w:t>
+      </w:r>
+      <w:r>
+        <w:t xml:space="preserve"> </w:t>
+      </w:r>
+      <w:r>
+        <w:rPr>
+          <w:rStyle w:val="VerbatimChar"/>
+        </w:rPr>
+        <w:t xml:space="preserve">app.&lt;domaine&gt;</w:t>
+      </w:r>
+      <w:r>
+        <w:t xml:space="preserve">).</w:t>
       </w:r>
     </w:p>
     <w:bookmarkEnd w:id="23"/>
-    <w:bookmarkStart w:id="24" w:name="Xc4320f2e7ea18d086ed43196d883583f6b56a0a"/>
+    <w:bookmarkStart w:id="24" w:name="X5b834cb03c4e663c3b4aa48c60b0b7108c34fa7"/>
+    <w:p>
+      <w:pPr>
+        <w:pStyle w:val="Heading3"/>
+      </w:pPr>
+      <w:r>
+        <w:t xml:space="preserve">Choix des sites (Recommandation, À vérifier)</w:t>
+      </w:r>
+    </w:p>
+    <w:tbl>
+      <w:tblPr>
+        <w:tblStyle w:val="Table"/>
+        <w:tblW w:type="auto" w:w="0"/>
+        <w:tblLook w:firstRow="1" w:lastRow="0" w:firstColumn="0" w:lastColumn="0" w:noHBand="0" w:noVBand="0" w:val="0020"/>
+        <w:jc w:val="start"/>
+      </w:tblPr>
+      <w:tblGrid>
+        <w:gridCol w:w="1980"/>
+        <w:gridCol w:w="1980"/>
+        <w:gridCol w:w="1980"/>
+        <w:gridCol w:w="1980"/>
+      </w:tblGrid>
+      <w:tr>
+        <w:trPr>
+          <w:tblHeader w:val="true"/>
+        </w:trPr>
+        <w:tc>
+          <w:tcPr/>
+          <w:p>
+            <w:pPr>
+              <w:pStyle w:val="Compact"/>
+              <w:jc w:val="left"/>
+            </w:pPr>
+            <w:r>
+              <w:t xml:space="preserve">Site</w:t>
+            </w:r>
+          </w:p>
+        </w:tc>
+        <w:tc>
+          <w:tcPr/>
+          <w:p>
+            <w:pPr>
+              <w:pStyle w:val="Compact"/>
+              <w:jc w:val="left"/>
+            </w:pPr>
+            <w:r>
+              <w:t xml:space="preserve">Rôle</w:t>
+            </w:r>
+          </w:p>
+        </w:tc>
+        <w:tc>
+          <w:tcPr/>
+          <w:p>
+            <w:pPr>
+              <w:pStyle w:val="Compact"/>
+              <w:jc w:val="left"/>
+            </w:pPr>
+            <w:r>
+              <w:t xml:space="preserve">Option recommandée</w:t>
+            </w:r>
+          </w:p>
+        </w:tc>
+        <w:tc>
+          <w:tcPr/>
+          <w:p>
+            <w:pPr>
+              <w:pStyle w:val="Compact"/>
+              <w:jc w:val="left"/>
+            </w:pPr>
+            <w:r>
+              <w:t xml:space="preserve">Points à confirmer</w:t>
+            </w:r>
+          </w:p>
+        </w:tc>
+      </w:tr>
+      <w:tr>
+        <w:tc>
+          <w:tcPr/>
+          <w:p>
+            <w:pPr>
+              <w:pStyle w:val="Compact"/>
+              <w:jc w:val="left"/>
+            </w:pPr>
+            <w:r>
+              <w:t xml:space="preserve">A</w:t>
+            </w:r>
+          </w:p>
+        </w:tc>
+        <w:tc>
+          <w:tcPr/>
+          <w:p>
+            <w:pPr>
+              <w:pStyle w:val="Compact"/>
+              <w:jc w:val="left"/>
+            </w:pPr>
+            <w:r>
+              <w:t xml:space="preserve">Principal, actif</w:t>
+            </w:r>
+          </w:p>
+        </w:tc>
+        <w:tc>
+          <w:tcPr/>
+          <w:p>
+            <w:pPr>
+              <w:pStyle w:val="Compact"/>
+              <w:jc w:val="left"/>
+            </w:pPr>
+            <w:r>
+              <w:t xml:space="preserve">Datacenter national de Diamniadio (État, exploité par Sénégal Numérique SA), inauguré en 2021 et présenté comme « de type Tier III »</w:t>
+            </w:r>
+          </w:p>
+        </w:tc>
+        <w:tc>
+          <w:tcPr/>
+          <w:p>
+            <w:pPr>
+              <w:pStyle w:val="Compact"/>
+              <w:jc w:val="left"/>
+            </w:pPr>
+            <w:r>
+              <w:t xml:space="preserve">Aucune certification Uptime Institute confirmée publiquement ; capacité, niveaux de service, sécurité physique et convention</w:t>
+            </w:r>
+            <w:r>
+              <w:t xml:space="preserve"> </w:t>
+            </w:r>
+            <w:r>
+              <w:rPr>
+                <w:bCs/>
+                <w:b/>
+              </w:rPr>
+              <w:t xml:space="preserve">À vérifier</w:t>
+            </w:r>
+            <w:r>
+              <w:t xml:space="preserve"> </w:t>
+            </w:r>
+            <w:r>
+              <w:t xml:space="preserve">; aucun engagement à ce jour</w:t>
+            </w:r>
+          </w:p>
+        </w:tc>
+      </w:tr>
+      <w:tr>
+        <w:tc>
+          <w:tcPr/>
+          <w:p>
+            <w:pPr>
+              <w:pStyle w:val="Compact"/>
+              <w:jc w:val="left"/>
+            </w:pPr>
+            <w:r>
+              <w:t xml:space="preserve">B</w:t>
+            </w:r>
+          </w:p>
+        </w:tc>
+        <w:tc>
+          <w:tcPr/>
+          <w:p>
+            <w:pPr>
+              <w:pStyle w:val="Compact"/>
+              <w:jc w:val="left"/>
+            </w:pPr>
+            <w:r>
+              <w:t xml:space="preserve">Secondaire, actif</w:t>
+            </w:r>
+          </w:p>
+        </w:tc>
+        <w:tc>
+          <w:tcPr/>
+          <w:p>
+            <w:pPr>
+              <w:pStyle w:val="Compact"/>
+              <w:jc w:val="left"/>
+            </w:pPr>
+            <w:r>
+              <w:t xml:space="preserve">Centre de données commercial certifié Tier III sur un site et un réseau électrique distincts : Sonatel (Orange) à Rufisque en premier choix, Yas (ex-Tigo) à Diamniadio en alternative</w:t>
+            </w:r>
+          </w:p>
+        </w:tc>
+        <w:tc>
+          <w:tcPr/>
+          <w:p>
+            <w:pPr>
+              <w:pStyle w:val="Compact"/>
+              <w:jc w:val="left"/>
+            </w:pPr>
+            <w:r>
+              <w:t xml:space="preserve">Certification de Rufisque annoncée mais</w:t>
+            </w:r>
+            <w:r>
+              <w:t xml:space="preserve"> </w:t>
+            </w:r>
+            <w:r>
+              <w:rPr>
+                <w:bCs/>
+                <w:b/>
+              </w:rPr>
+              <w:t xml:space="preserve">À vérifier</w:t>
+            </w:r>
+            <w:r>
+              <w:t xml:space="preserve"> </w:t>
+            </w:r>
+            <w:r>
+              <w:t xml:space="preserve">; Yas Diamniadio certifié Tier III par l'Uptime Institute en 2017 (validité</w:t>
+            </w:r>
+            <w:r>
+              <w:t xml:space="preserve"> </w:t>
+            </w:r>
+            <w:r>
+              <w:rPr>
+                <w:bCs/>
+                <w:b/>
+              </w:rPr>
+              <w:t xml:space="preserve">À vérifier</w:t>
+            </w:r>
+            <w:r>
+              <w:t xml:space="preserve">) mais situé dans la même zone que le site A</w:t>
+            </w:r>
+          </w:p>
+        </w:tc>
+      </w:tr>
+      <w:tr>
+        <w:tc>
+          <w:tcPr/>
+          <w:p>
+            <w:pPr>
+              <w:pStyle w:val="Compact"/>
+              <w:jc w:val="left"/>
+            </w:pPr>
+            <w:r>
+              <w:t xml:space="preserve">C</w:t>
+            </w:r>
+          </w:p>
+        </w:tc>
+        <w:tc>
+          <w:tcPr/>
+          <w:p>
+            <w:pPr>
+              <w:pStyle w:val="Compact"/>
+              <w:jc w:val="left"/>
+            </w:pPr>
+            <w:r>
+              <w:t xml:space="preserve">Coffre de sauvegarde</w:t>
+            </w:r>
+          </w:p>
+        </w:tc>
+        <w:tc>
+          <w:tcPr/>
+          <w:p>
+            <w:pPr>
+              <w:pStyle w:val="Compact"/>
+              <w:jc w:val="left"/>
+            </w:pPr>
+            <w:r>
+              <w:t xml:space="preserve">Site sécurisé de l'État ou installation distincte, hors de la zone Dakar–Diamniadio–Rufisque si possible</w:t>
+            </w:r>
+          </w:p>
+        </w:tc>
+        <w:tc>
+          <w:tcPr/>
+          <w:p>
+            <w:pPr>
+              <w:pStyle w:val="Compact"/>
+              <w:jc w:val="left"/>
+            </w:pPr>
+            <w:r>
+              <w:t xml:space="preserve">Site à identifier avec Sénégal Numérique (</w:t>
+            </w:r>
+            <w:r>
+              <w:rPr>
+                <w:bCs/>
+                <w:b/>
+              </w:rPr>
+              <w:t xml:space="preserve">À vérifier</w:t>
+            </w:r>
+            <w:r>
+              <w:t xml:space="preserve">)</w:t>
+            </w:r>
+          </w:p>
+        </w:tc>
+      </w:tr>
+    </w:tbl>
+    <w:p>
+      <w:pPr>
+        <w:pStyle w:val="BodyText"/>
+      </w:pPr>
+      <w:r>
+        <w:t xml:space="preserve">La comparaison détaillée des options figure dans la page</w:t>
+      </w:r>
+      <w:r>
+        <w:t xml:space="preserve"> </w:t>
+      </w:r>
+      <w:r>
+        <w:rPr>
+          <w:iCs/>
+          <w:i/>
+        </w:rPr>
+        <w:t xml:space="preserve">Plan de déploiement — infrastructure haute disponibilité au Sénégal</w:t>
+      </w:r>
+      <w:r>
+        <w:t xml:space="preserve">.</w:t>
+      </w:r>
+    </w:p>
+    <w:bookmarkEnd w:id="24"/>
+    <w:bookmarkStart w:id="25" w:name="Xc4320f2e7ea18d086ed43196d883583f6b56a0a"/>
     <w:p>
       <w:pPr>
         <w:pStyle w:val="Heading3"/>
@@ -1868,59 +2311,85 @@
               <w:jc w:val="left"/>
             </w:pPr>
             <w:r>
-              <w:t xml:space="preserve">99,95 %</w:t>
-            </w:r>
-          </w:p>
-        </w:tc>
-      </w:tr>
-      <w:tr>
-        <w:tc>
-          <w:tcPr/>
-          <w:p>
-            <w:pPr>
-              <w:pStyle w:val="Compact"/>
-              <w:jc w:val="left"/>
-            </w:pPr>
-            <w:r>
-              <w:t xml:space="preserve">Perte de données maximale (RPO)</w:t>
-            </w:r>
-          </w:p>
-        </w:tc>
-        <w:tc>
-          <w:tcPr/>
-          <w:p>
-            <w:pPr>
-              <w:pStyle w:val="Compact"/>
-              <w:jc w:val="left"/>
-            </w:pPr>
-            <w:r>
-              <w:t xml:space="preserve">Moins de 5 minutes</w:t>
-            </w:r>
-          </w:p>
-        </w:tc>
-      </w:tr>
-      <w:tr>
-        <w:tc>
-          <w:tcPr/>
-          <w:p>
-            <w:pPr>
-              <w:pStyle w:val="Compact"/>
-              <w:jc w:val="left"/>
-            </w:pPr>
-            <w:r>
-              <w:t xml:space="preserve">Délai de reprise (RTO)</w:t>
-            </w:r>
-          </w:p>
-        </w:tc>
-        <w:tc>
-          <w:tcPr/>
-          <w:p>
-            <w:pPr>
-              <w:pStyle w:val="Compact"/>
-              <w:jc w:val="left"/>
-            </w:pPr>
-            <w:r>
-              <w:t xml:space="preserve">Moins d'une heure</w:t>
+              <w:t xml:space="preserve">99,95 % ou plus</w:t>
+            </w:r>
+          </w:p>
+        </w:tc>
+      </w:tr>
+      <w:tr>
+        <w:tc>
+          <w:tcPr/>
+          <w:p>
+            <w:pPr>
+              <w:pStyle w:val="Compact"/>
+              <w:jc w:val="left"/>
+            </w:pPr>
+            <w:r>
+              <w:t xml:space="preserve">Perte de données dans un site (RPO)</w:t>
+            </w:r>
+          </w:p>
+        </w:tc>
+        <w:tc>
+          <w:tcPr/>
+          <w:p>
+            <w:pPr>
+              <w:pStyle w:val="Compact"/>
+              <w:jc w:val="left"/>
+            </w:pPr>
+            <w:r>
+              <w:t xml:space="preserve">Nulle (réplication synchrone)</w:t>
+            </w:r>
+          </w:p>
+        </w:tc>
+      </w:tr>
+      <w:tr>
+        <w:tc>
+          <w:tcPr/>
+          <w:p>
+            <w:pPr>
+              <w:pStyle w:val="Compact"/>
+              <w:jc w:val="left"/>
+            </w:pPr>
+            <w:r>
+              <w:t xml:space="preserve">Perte de données en cas de perte d'un site (RPO)</w:t>
+            </w:r>
+          </w:p>
+        </w:tc>
+        <w:tc>
+          <w:tcPr/>
+          <w:p>
+            <w:pPr>
+              <w:pStyle w:val="Compact"/>
+              <w:jc w:val="left"/>
+            </w:pPr>
+            <w:r>
+              <w:t xml:space="preserve">5 minutes au plus (nulle tant que la réplication synchrone A → B est saine)</w:t>
+            </w:r>
+          </w:p>
+        </w:tc>
+      </w:tr>
+      <w:tr>
+        <w:tc>
+          <w:tcPr/>
+          <w:p>
+            <w:pPr>
+              <w:pStyle w:val="Compact"/>
+              <w:jc w:val="left"/>
+            </w:pPr>
+            <w:r>
+              <w:t xml:space="preserve">Délai de reprise en cas de perte d'un site (RTO)</w:t>
+            </w:r>
+          </w:p>
+        </w:tc>
+        <w:tc>
+          <w:tcPr/>
+          <w:p>
+            <w:pPr>
+              <w:pStyle w:val="Compact"/>
+              <w:jc w:val="left"/>
+            </w:pPr>
+            <w:r>
+              <w:t xml:space="preserve">Une heure au plus</w:t>
             </w:r>
           </w:p>
         </w:tc>
@@ -1946,7 +2415,7 @@
               <w:jc w:val="left"/>
             </w:pPr>
             <w:r>
-              <w:t xml:space="preserve">100 %, y compris en mode dégradé</w:t>
+              <w:t xml:space="preserve">100 %, y compris sans liaison avec le central</w:t>
             </w:r>
           </w:p>
         </w:tc>
@@ -1972,7 +2441,33 @@
               <w:jc w:val="left"/>
             </w:pPr>
             <w:r>
-              <w:t xml:space="preserve">Semestriels</w:t>
+              <w:t xml:space="preserve">Deux fois par an au minimum</w:t>
+            </w:r>
+          </w:p>
+        </w:tc>
+      </w:tr>
+      <w:tr>
+        <w:tc>
+          <w:tcPr/>
+          <w:p>
+            <w:pPr>
+              <w:pStyle w:val="Compact"/>
+              <w:jc w:val="left"/>
+            </w:pPr>
+            <w:r>
+              <w:t xml:space="preserve">Tests de restauration</w:t>
+            </w:r>
+          </w:p>
+        </w:tc>
+        <w:tc>
+          <w:tcPr/>
+          <w:p>
+            <w:pPr>
+              <w:pStyle w:val="Compact"/>
+              <w:jc w:val="left"/>
+            </w:pPr>
+            <w:r>
+              <w:t xml:space="preserve">Chaque trimestre</w:t>
             </w:r>
           </w:p>
         </w:tc>
@@ -1986,14 +2481,14 @@
         <w:t xml:space="preserve">Ces valeurs sont des objectifs de conception, pas des engagements contractuels.</w:t>
       </w:r>
     </w:p>
-    <w:bookmarkEnd w:id="24"/>
-    <w:bookmarkStart w:id="25" w:name="X12278915665d343776aad29e2c50c6c0c183c38"/>
+    <w:bookmarkEnd w:id="25"/>
+    <w:bookmarkStart w:id="26" w:name="liaisons-réseau"/>
     <w:p>
       <w:pPr>
         <w:pStyle w:val="Heading3"/>
       </w:pPr>
       <w:r>
-        <w:t xml:space="preserve">Liaisons entre les postes et le centre de données</w:t>
+        <w:t xml:space="preserve">Liaisons réseau</w:t>
       </w:r>
     </w:p>
     <w:tbl>
@@ -2045,45 +2540,149 @@
               <w:jc w:val="left"/>
             </w:pPr>
             <w:r>
-              <w:t xml:space="preserve">Liaison principale</w:t>
-            </w:r>
-          </w:p>
-        </w:tc>
-        <w:tc>
-          <w:tcPr/>
-          <w:p>
-            <w:pPr>
-              <w:pStyle w:val="Compact"/>
-              <w:jc w:val="left"/>
-            </w:pPr>
-            <w:r>
-              <w:t xml:space="preserve">MPLS ou VPN chiffré entre chaque poste et le centre principal, avec bascule vers le site de secours</w:t>
-            </w:r>
-          </w:p>
-        </w:tc>
-      </w:tr>
-      <w:tr>
-        <w:tc>
-          <w:tcPr/>
-          <w:p>
-            <w:pPr>
-              <w:pStyle w:val="Compact"/>
-              <w:jc w:val="left"/>
-            </w:pPr>
-            <w:r>
-              <w:t xml:space="preserve">Liaison de secours</w:t>
-            </w:r>
-          </w:p>
-        </w:tc>
-        <w:tc>
-          <w:tcPr/>
-          <w:p>
-            <w:pPr>
-              <w:pStyle w:val="Compact"/>
-              <w:jc w:val="left"/>
-            </w:pPr>
-            <w:r>
-              <w:t xml:space="preserve">4G ou VSAT par poste, en particulier pour les postes terrestres éloignés (Kidira, Rosso, Karang)</w:t>
+              <w:t xml:space="preserve">Internet des sites centraux</w:t>
+            </w:r>
+          </w:p>
+        </w:tc>
+        <w:tc>
+          <w:tcPr/>
+          <w:p>
+            <w:pPr>
+              <w:pStyle w:val="Compact"/>
+              <w:jc w:val="left"/>
+            </w:pPr>
+            <w:r>
+              <w:t xml:space="preserve">Deux opérateurs différents par site, sur des chemins physiques distincts</w:t>
+            </w:r>
+          </w:p>
+        </w:tc>
+      </w:tr>
+      <w:tr>
+        <w:tc>
+          <w:tcPr/>
+          <w:p>
+            <w:pPr>
+              <w:pStyle w:val="Compact"/>
+              <w:jc w:val="left"/>
+            </w:pPr>
+            <w:r>
+              <w:t xml:space="preserve">Liaison entre les sites A et B</w:t>
+            </w:r>
+          </w:p>
+        </w:tc>
+        <w:tc>
+          <w:tcPr/>
+          <w:p>
+            <w:pPr>
+              <w:pStyle w:val="Compact"/>
+              <w:jc w:val="left"/>
+            </w:pPr>
+            <w:r>
+              <w:t xml:space="preserve">Fibre noire ou liaison dédiée sur deux chemins physiques distincts, chiffrée, à faible latence (réplication synchrone)</w:t>
+            </w:r>
+          </w:p>
+        </w:tc>
+      </w:tr>
+      <w:tr>
+        <w:tc>
+          <w:tcPr/>
+          <w:p>
+            <w:pPr>
+              <w:pStyle w:val="Compact"/>
+              <w:jc w:val="left"/>
+            </w:pPr>
+            <w:r>
+              <w:t xml:space="preserve">Liaison vers le site C</w:t>
+            </w:r>
+          </w:p>
+        </w:tc>
+        <w:tc>
+          <w:tcPr/>
+          <w:p>
+            <w:pPr>
+              <w:pStyle w:val="Compact"/>
+              <w:jc w:val="left"/>
+            </w:pPr>
+            <w:r>
+              <w:t xml:space="preserve">Liaison chiffrée dédiée pour l'archivage continu ; copies hors ligne transportées selon une procédure sécurisée</w:t>
+            </w:r>
+          </w:p>
+        </w:tc>
+      </w:tr>
+      <w:tr>
+        <w:tc>
+          <w:tcPr/>
+          <w:p>
+            <w:pPr>
+              <w:pStyle w:val="Compact"/>
+              <w:jc w:val="left"/>
+            </w:pPr>
+            <w:r>
+              <w:t xml:space="preserve">Liaison principale des postes</w:t>
+            </w:r>
+          </w:p>
+        </w:tc>
+        <w:tc>
+          <w:tcPr/>
+          <w:p>
+            <w:pPr>
+              <w:pStyle w:val="Compact"/>
+              <w:jc w:val="left"/>
+            </w:pPr>
+            <w:r>
+              <w:t xml:space="preserve">MPLS ou VPN chiffré entre chaque poste et les deux sites centraux, bascule automatique de l'un vers l'autre</w:t>
+            </w:r>
+          </w:p>
+        </w:tc>
+      </w:tr>
+      <w:tr>
+        <w:tc>
+          <w:tcPr/>
+          <w:p>
+            <w:pPr>
+              <w:pStyle w:val="Compact"/>
+              <w:jc w:val="left"/>
+            </w:pPr>
+            <w:r>
+              <w:t xml:space="preserve">Liaison de secours des postes</w:t>
+            </w:r>
+          </w:p>
+        </w:tc>
+        <w:tc>
+          <w:tcPr/>
+          <w:p>
+            <w:pPr>
+              <w:pStyle w:val="Compact"/>
+              <w:jc w:val="left"/>
+            </w:pPr>
+            <w:r>
+              <w:t xml:space="preserve">4G ou VSAT par poste, chez un opérateur différent de la liaison principale, en particulier pour les postes terrestres éloignés (Kidira, Rosso, Karang)</w:t>
+            </w:r>
+          </w:p>
+        </w:tc>
+      </w:tr>
+      <w:tr>
+        <w:tc>
+          <w:tcPr/>
+          <w:p>
+            <w:pPr>
+              <w:pStyle w:val="Compact"/>
+              <w:jc w:val="left"/>
+            </w:pPr>
+            <w:r>
+              <w:t xml:space="preserve">Partenaires</w:t>
+            </w:r>
+          </w:p>
+        </w:tc>
+        <w:tc>
+          <w:tcPr/>
+          <w:p>
+            <w:pPr>
+              <w:pStyle w:val="Compact"/>
+              <w:jc w:val="left"/>
+            </w:pPr>
+            <w:r>
+              <w:t xml:space="preserve">Interpol via le BCN de Dakar (I-24/7), WAPIS, FPR, DAF et DGCPT par liaisons privées ou VPN, selon les accords (À vérifier) ; compagnies aériennes par Internet derrière le WAF</w:t>
             </w:r>
           </w:p>
         </w:tc>
@@ -2183,8 +2782,8 @@
         </w:tc>
       </w:tr>
     </w:tbl>
-    <w:bookmarkEnd w:id="25"/>
-    <w:bookmarkStart w:id="26" w:name="mode-hors-ligne-à-développer"/>
+    <w:bookmarkEnd w:id="26"/>
+    <w:bookmarkStart w:id="27" w:name="mode-hors-ligne-à-développer"/>
     <w:p>
       <w:pPr>
         <w:pStyle w:val="Heading3"/>
@@ -2214,7 +2813,7 @@
         <w:t xml:space="preserve"> </w:t>
       </w:r>
       <w:r>
-        <w:t xml:space="preserve">de mode hors ligne : un poste qui perd sa liaison ne peut plus enregistrer de passage. L'architecture cible prévoit un</w:t>
+        <w:t xml:space="preserve">de mode hors ligne : un poste qui perd sa liaison ne peut plus enregistrer de passage. L'architecture cible prévoit dans chaque poste un</w:t>
       </w:r>
       <w:r>
         <w:t xml:space="preserve"> </w:t>
@@ -2258,7 +2857,7 @@
         <w:t xml:space="preserve">Supervision systèmes</w:t>
       </w:r>
       <w:r>
-        <w:t xml:space="preserve">) qui :</w:t>
+        <w:t xml:space="preserve">), composé de deux nœuds, auquel se rattachent les guichets et les eGates, et qui :</w:t>
       </w:r>
     </w:p>
     <w:p>
@@ -2315,7 +2914,19 @@
         <w:pStyle w:val="Compact"/>
       </w:pPr>
       <w:r>
-        <w:t xml:space="preserve">déclenche une alerte locale en cas de correspondance critique.</w:t>
+        <w:t xml:space="preserve">déclenche une alerte locale en cas de correspondance critique ;</w:t>
+      </w:r>
+    </w:p>
+    <w:p>
+      <w:pPr>
+        <w:numPr>
+          <w:ilvl w:val="0"/>
+          <w:numId w:val="1002"/>
+        </w:numPr>
+        <w:pStyle w:val="Compact"/>
+      </w:pPr>
+      <w:r>
+        <w:t xml:space="preserve">permet au poste de poursuivre le contrôle même si les deux sites centraux sont indisponibles.</w:t>
       </w:r>
     </w:p>
     <w:p>
@@ -2342,14 +2953,38 @@
         <w:t xml:space="preserve">écrite, validée par la DPAF.</w:t>
       </w:r>
     </w:p>
-    <w:bookmarkEnd w:id="26"/>
-    <w:bookmarkStart w:id="27" w:name="sauvegardes-et-reprise"/>
+    <w:bookmarkEnd w:id="27"/>
+    <w:bookmarkStart w:id="28" w:name="sauvegardes-et-reprise"/>
     <w:p>
       <w:pPr>
         <w:pStyle w:val="Heading3"/>
       </w:pPr>
       <w:r>
         <w:t xml:space="preserve">Sauvegardes et reprise</w:t>
+      </w:r>
+    </w:p>
+    <w:p>
+      <w:pPr>
+        <w:pStyle w:val="FirstParagraph"/>
+      </w:pPr>
+      <w:r>
+        <w:t xml:space="preserve">La stratégie suit la règle</w:t>
+      </w:r>
+      <w:r>
+        <w:t xml:space="preserve"> </w:t>
+      </w:r>
+      <w:r>
+        <w:rPr>
+          <w:bCs/>
+          <w:b/>
+        </w:rPr>
+        <w:t xml:space="preserve">3-2-1-1-0</w:t>
+      </w:r>
+      <w:r>
+        <w:t xml:space="preserve"> </w:t>
+      </w:r>
+      <w:r>
+        <w:t xml:space="preserve">: trois copies, sur deux types de supports, dont une hors site (site C), une immuable ou hors ligne, et zéro erreur constatée lors des vérifications (Recommandation).</w:t>
       </w:r>
     </w:p>
     <w:tbl>
@@ -2413,33 +3048,59 @@
               <w:jc w:val="left"/>
             </w:pPr>
             <w:r>
-              <w:t xml:space="preserve">Réplication vers le site de secours ; sauvegardes complètes et incrémentales chiffrées</w:t>
-            </w:r>
-          </w:p>
-        </w:tc>
-      </w:tr>
-      <w:tr>
-        <w:tc>
-          <w:tcPr/>
-          <w:p>
-            <w:pPr>
-              <w:pStyle w:val="Compact"/>
-              <w:jc w:val="left"/>
-            </w:pPr>
-            <w:r>
-              <w:t xml:space="preserve">Copie hors ligne</w:t>
-            </w:r>
-          </w:p>
-        </w:tc>
-        <w:tc>
-          <w:tcPr/>
-          <w:p>
-            <w:pPr>
-              <w:pStyle w:val="Compact"/>
-              <w:jc w:val="left"/>
-            </w:pPr>
-            <w:r>
-              <w:t xml:space="preserve">Sauvegarde chiffrée déconnectée du réseau, conservée sur le territoire</w:t>
+              <w:t xml:space="preserve">Réplication synchrone du site A vers le site B ; archivage continu des journaux de transactions (restauration à un instant donné) ; sauvegarde complète quotidienne et incrémentale horaire, copiées vers le site C</w:t>
+            </w:r>
+          </w:p>
+        </w:tc>
+      </w:tr>
+      <w:tr>
+        <w:tc>
+          <w:tcPr/>
+          <w:p>
+            <w:pPr>
+              <w:pStyle w:val="Compact"/>
+              <w:jc w:val="left"/>
+            </w:pPr>
+            <w:r>
+              <w:t xml:space="preserve">Stockage objet (biométrie, documents)</w:t>
+            </w:r>
+          </w:p>
+        </w:tc>
+        <w:tc>
+          <w:tcPr/>
+          <w:p>
+            <w:pPr>
+              <w:pStyle w:val="Compact"/>
+              <w:jc w:val="left"/>
+            </w:pPr>
+            <w:r>
+              <w:t xml:space="preserve">Réplication entre A et B, versionnement, copie quotidienne vers le site C</w:t>
+            </w:r>
+          </w:p>
+        </w:tc>
+      </w:tr>
+      <w:tr>
+        <w:tc>
+          <w:tcPr/>
+          <w:p>
+            <w:pPr>
+              <w:pStyle w:val="Compact"/>
+              <w:jc w:val="left"/>
+            </w:pPr>
+            <w:r>
+              <w:t xml:space="preserve">Copie immuable et hors ligne</w:t>
+            </w:r>
+          </w:p>
+        </w:tc>
+        <w:tc>
+          <w:tcPr/>
+          <w:p>
+            <w:pPr>
+              <w:pStyle w:val="Compact"/>
+              <w:jc w:val="left"/>
+            </w:pPr>
+            <w:r>
+              <w:t xml:space="preserve">Stockage à écriture unique au site C ; copie hors ligne chiffrée hebdomadaire conservée en coffre, sur le territoire</w:t>
             </w:r>
           </w:p>
         </w:tc>
@@ -2465,7 +3126,7 @@
               <w:jc w:val="left"/>
             </w:pPr>
             <w:r>
-              <w:t xml:space="preserve">Archivage régulier ; ancrage périodique de la tête de chaîne par une signature HSM</w:t>
+              <w:t xml:space="preserve">Export quotidien de la chaîne ; ancrage périodique de la tête de chaîne par une signature HSM (À développer)</w:t>
             </w:r>
           </w:p>
         </w:tc>
@@ -2491,7 +3152,68 @@
               <w:jc w:val="left"/>
             </w:pPr>
             <w:r>
-              <w:t xml:space="preserve">Conservés dans un HSM ; procédure de séquestre validée par la sécurité</w:t>
+              <w:t xml:space="preserve">Conservés dans une paire de HSM par site central ; sauvegarde des clés partagée entre plusieurs dépositaires</w:t>
+            </w:r>
+          </w:p>
+        </w:tc>
+      </w:tr>
+      <w:tr>
+        <w:tc>
+          <w:tcPr/>
+          <w:p>
+            <w:pPr>
+              <w:pStyle w:val="Compact"/>
+              <w:jc w:val="left"/>
+            </w:pPr>
+            <w:r>
+              <w:t xml:space="preserve">Conservation</w:t>
+            </w:r>
+          </w:p>
+        </w:tc>
+        <w:tc>
+          <w:tcPr/>
+          <w:p>
+            <w:pPr>
+              <w:pStyle w:val="Compact"/>
+              <w:jc w:val="left"/>
+            </w:pPr>
+            <w:r>
+              <w:t xml:space="preserve">5 ans affichés dans WawID (</w:t>
+            </w:r>
+            <w:r>
+              <w:rPr>
+                <w:rStyle w:val="VerbatimChar"/>
+              </w:rPr>
+              <w:t xml:space="preserve">retentionDays</w:t>
+            </w:r>
+            <w:r>
+              <w:t xml:space="preserve">) ; durée légale</w:t>
+            </w:r>
+            <w:r>
+              <w:t xml:space="preserve"> </w:t>
+            </w:r>
+            <w:r>
+              <w:rPr>
+                <w:bCs/>
+                <w:b/>
+              </w:rPr>
+              <w:t xml:space="preserve">À vérifier</w:t>
+            </w:r>
+            <w:r>
+              <w:t xml:space="preserve"> </w:t>
+            </w:r>
+            <w:r>
+              <w:t xml:space="preserve">; purge automatique</w:t>
+            </w:r>
+            <w:r>
+              <w:t xml:space="preserve"> </w:t>
+            </w:r>
+            <w:r>
+              <w:rPr>
+                <w:bCs/>
+                <w:b/>
+              </w:rPr>
+              <w:t xml:space="preserve">À développer</w:t>
             </w:r>
           </w:p>
         </w:tc>
@@ -2517,15 +3239,36 @@
               <w:jc w:val="left"/>
             </w:pPr>
             <w:r>
-              <w:t xml:space="preserve">Restauration testée au moins avant chaque phase et à chaque test de bascule</w:t>
+              <w:t xml:space="preserve">Restauration testée chaque trimestre ; restauration depuis le site C et bascule entre sites lors des exercices semestriels</w:t>
             </w:r>
           </w:p>
         </w:tc>
       </w:tr>
     </w:tbl>
-    <w:bookmarkEnd w:id="27"/>
+    <w:p>
+      <w:pPr>
+        <w:pStyle w:val="BodyText"/>
+      </w:pPr>
+      <w:r>
+        <w:t xml:space="preserve">Les scénarios de défaillance, la procédure de bascule et le retour à la normale sont décrits dans la page</w:t>
+      </w:r>
+      <w:r>
+        <w:t xml:space="preserve"> </w:t>
+      </w:r>
+      <w:r>
+        <w:rPr>
+          <w:iCs/>
+          <w:i/>
+        </w:rPr>
+        <w:t xml:space="preserve">Plan de déploiement — infrastructure haute disponibilité au Sénégal</w:t>
+      </w:r>
+      <w:r>
+        <w:t xml:space="preserve">.</w:t>
+      </w:r>
+    </w:p>
     <w:bookmarkEnd w:id="28"/>
-    <w:bookmarkStart w:id="29" w:name="prérequis-juridiques-et-réglementaires"/>
+    <w:bookmarkEnd w:id="29"/>
+    <w:bookmarkStart w:id="30" w:name="prérequis-juridiques-et-réglementaires"/>
     <w:p>
       <w:pPr>
         <w:pStyle w:val="Heading2"/>
@@ -3002,8 +3745,8 @@
         </w:tc>
       </w:tr>
     </w:tbl>
-    <w:bookmarkEnd w:id="29"/>
-    <w:bookmarkStart w:id="33" w:name="matériel-par-type-de-poste"/>
+    <w:bookmarkEnd w:id="30"/>
+    <w:bookmarkStart w:id="35" w:name="matériel-par-type-de-poste"/>
     <w:p>
       <w:pPr>
         <w:pStyle w:val="Heading2"/>
@@ -3012,7 +3755,7 @@
         <w:t xml:space="preserve">Matériel par type de poste</w:t>
       </w:r>
     </w:p>
-    <w:bookmarkStart w:id="30" w:name="par-poste-de-travail"/>
+    <w:bookmarkStart w:id="31" w:name="par-poste-de-travail"/>
     <w:p>
       <w:pPr>
         <w:pStyle w:val="Heading3"/>
@@ -3489,7 +4232,7 @@
               <w:jc w:val="left"/>
             </w:pPr>
             <w:r>
-              <w:t xml:space="preserve">Douchette QR (e-Visa, WawPass)</w:t>
+              <w:t xml:space="preserve">Douchette QR (e-Visa)</w:t>
             </w:r>
           </w:p>
         </w:tc>
@@ -3791,8 +4534,8 @@
         </w:tc>
       </w:tr>
     </w:tbl>
-    <w:bookmarkEnd w:id="30"/>
-    <w:bookmarkStart w:id="31" w:name="par-type-de-poste"/>
+    <w:bookmarkEnd w:id="31"/>
+    <w:bookmarkStart w:id="32" w:name="par-type-de-poste"/>
     <w:p>
       <w:pPr>
         <w:pStyle w:val="Heading3"/>
@@ -4087,8 +4830,506 @@
         </w:tc>
       </w:tr>
     </w:tbl>
-    <w:bookmarkEnd w:id="31"/>
-    <w:bookmarkStart w:id="32" w:name="alimentation-électrique-recommandation"/>
+    <w:bookmarkEnd w:id="32"/>
+    <w:bookmarkStart w:id="33" w:name="sites-centraux"/>
+    <w:p>
+      <w:pPr>
+        <w:pStyle w:val="Heading3"/>
+      </w:pPr>
+      <w:r>
+        <w:t xml:space="preserve">Sites centraux</w:t>
+      </w:r>
+    </w:p>
+    <w:p>
+      <w:pPr>
+        <w:pStyle w:val="FirstParagraph"/>
+      </w:pPr>
+      <w:r>
+        <w:t xml:space="preserve">Les quantités sont à dimensionner lors de l'étude détaillée ; la nomenclature complète figure dans la page</w:t>
+      </w:r>
+      <w:r>
+        <w:t xml:space="preserve"> </w:t>
+      </w:r>
+      <w:r>
+        <w:rPr>
+          <w:iCs/>
+          <w:i/>
+        </w:rPr>
+        <w:t xml:space="preserve">Plan de déploiement — infrastructure haute disponibilité au Sénégal</w:t>
+      </w:r>
+      <w:r>
+        <w:t xml:space="preserve">.</w:t>
+      </w:r>
+    </w:p>
+    <w:tbl>
+      <w:tblPr>
+        <w:tblStyle w:val="Table"/>
+        <w:tblW w:type="auto" w:w="0"/>
+        <w:tblLook w:firstRow="1" w:lastRow="0" w:firstColumn="0" w:lastColumn="0" w:noHBand="0" w:noVBand="0" w:val="0020"/>
+        <w:jc w:val="start"/>
+      </w:tblPr>
+      <w:tblGrid>
+        <w:gridCol w:w="1980"/>
+        <w:gridCol w:w="1980"/>
+        <w:gridCol w:w="1980"/>
+        <w:gridCol w:w="1980"/>
+      </w:tblGrid>
+      <w:tr>
+        <w:trPr>
+          <w:tblHeader w:val="true"/>
+        </w:trPr>
+        <w:tc>
+          <w:tcPr/>
+          <w:p>
+            <w:pPr>
+              <w:pStyle w:val="Compact"/>
+              <w:jc w:val="left"/>
+            </w:pPr>
+            <w:r>
+              <w:t xml:space="preserve">Équipement</w:t>
+            </w:r>
+          </w:p>
+        </w:tc>
+        <w:tc>
+          <w:tcPr/>
+          <w:p>
+            <w:pPr>
+              <w:pStyle w:val="Compact"/>
+              <w:jc w:val="left"/>
+            </w:pPr>
+            <w:r>
+              <w:t xml:space="preserve">Site A</w:t>
+            </w:r>
+          </w:p>
+        </w:tc>
+        <w:tc>
+          <w:tcPr/>
+          <w:p>
+            <w:pPr>
+              <w:pStyle w:val="Compact"/>
+              <w:jc w:val="left"/>
+            </w:pPr>
+            <w:r>
+              <w:t xml:space="preserve">Site B</w:t>
+            </w:r>
+          </w:p>
+        </w:tc>
+        <w:tc>
+          <w:tcPr/>
+          <w:p>
+            <w:pPr>
+              <w:pStyle w:val="Compact"/>
+              <w:jc w:val="left"/>
+            </w:pPr>
+            <w:r>
+              <w:t xml:space="preserve">Site C</w:t>
+            </w:r>
+          </w:p>
+        </w:tc>
+      </w:tr>
+      <w:tr>
+        <w:tc>
+          <w:tcPr/>
+          <w:p>
+            <w:pPr>
+              <w:pStyle w:val="Compact"/>
+              <w:jc w:val="left"/>
+            </w:pPr>
+            <w:r>
+              <w:t xml:space="preserve">Routeurs (deux opérateurs), pare-feu, commutateurs</w:t>
+            </w:r>
+          </w:p>
+        </w:tc>
+        <w:tc>
+          <w:tcPr/>
+          <w:p>
+            <w:pPr>
+              <w:pStyle w:val="Compact"/>
+              <w:jc w:val="left"/>
+            </w:pPr>
+            <w:r>
+              <w:t xml:space="preserve">Par paires</w:t>
+            </w:r>
+          </w:p>
+        </w:tc>
+        <w:tc>
+          <w:tcPr/>
+          <w:p>
+            <w:pPr>
+              <w:pStyle w:val="Compact"/>
+              <w:jc w:val="left"/>
+            </w:pPr>
+            <w:r>
+              <w:t xml:space="preserve">Par paires</w:t>
+            </w:r>
+          </w:p>
+        </w:tc>
+        <w:tc>
+          <w:tcPr/>
+          <w:p>
+            <w:pPr>
+              <w:pStyle w:val="Compact"/>
+              <w:jc w:val="left"/>
+            </w:pPr>
+            <w:r>
+              <w:t xml:space="preserve">Selon le site</w:t>
+            </w:r>
+          </w:p>
+        </w:tc>
+      </w:tr>
+      <w:tr>
+        <w:tc>
+          <w:tcPr/>
+          <w:p>
+            <w:pPr>
+              <w:pStyle w:val="Compact"/>
+              <w:jc w:val="left"/>
+            </w:pPr>
+            <w:r>
+              <w:t xml:space="preserve">Répartiteurs de charge et WAF</w:t>
+            </w:r>
+          </w:p>
+        </w:tc>
+        <w:tc>
+          <w:tcPr/>
+          <w:p>
+            <w:pPr>
+              <w:pStyle w:val="Compact"/>
+              <w:jc w:val="left"/>
+            </w:pPr>
+            <w:r>
+              <w:t xml:space="preserve">Paire</w:t>
+            </w:r>
+          </w:p>
+        </w:tc>
+        <w:tc>
+          <w:tcPr/>
+          <w:p>
+            <w:pPr>
+              <w:pStyle w:val="Compact"/>
+              <w:jc w:val="left"/>
+            </w:pPr>
+            <w:r>
+              <w:t xml:space="preserve">Paire</w:t>
+            </w:r>
+          </w:p>
+        </w:tc>
+        <w:tc>
+          <w:tcPr/>
+          <w:p>
+            <w:pPr>
+              <w:pStyle w:val="Compact"/>
+              <w:jc w:val="left"/>
+            </w:pPr>
+            <w:r>
+              <w:t xml:space="preserve">—</w:t>
+            </w:r>
+          </w:p>
+        </w:tc>
+      </w:tr>
+      <w:tr>
+        <w:tc>
+          <w:tcPr/>
+          <w:p>
+            <w:pPr>
+              <w:pStyle w:val="Compact"/>
+              <w:jc w:val="left"/>
+            </w:pPr>
+            <w:r>
+              <w:t xml:space="preserve">Serveurs de la plateforme d'exécution (Kubernetes ou équivalent)</w:t>
+            </w:r>
+          </w:p>
+        </w:tc>
+        <w:tc>
+          <w:tcPr/>
+          <w:p>
+            <w:pPr>
+              <w:pStyle w:val="Compact"/>
+              <w:jc w:val="left"/>
+            </w:pPr>
+            <w:r>
+              <w:t xml:space="preserve">3 nœuds de contrôle + nœuds de travail à dimensionner</w:t>
+            </w:r>
+          </w:p>
+        </w:tc>
+        <w:tc>
+          <w:tcPr/>
+          <w:p>
+            <w:pPr>
+              <w:pStyle w:val="Compact"/>
+              <w:jc w:val="left"/>
+            </w:pPr>
+            <w:r>
+              <w:t xml:space="preserve">Idem</w:t>
+            </w:r>
+          </w:p>
+        </w:tc>
+        <w:tc>
+          <w:tcPr/>
+          <w:p>
+            <w:pPr>
+              <w:pStyle w:val="Compact"/>
+              <w:jc w:val="left"/>
+            </w:pPr>
+            <w:r>
+              <w:t xml:space="preserve">—</w:t>
+            </w:r>
+          </w:p>
+        </w:tc>
+      </w:tr>
+      <w:tr>
+        <w:tc>
+          <w:tcPr/>
+          <w:p>
+            <w:pPr>
+              <w:pStyle w:val="Compact"/>
+              <w:jc w:val="left"/>
+            </w:pPr>
+            <w:r>
+              <w:t xml:space="preserve">Serveurs de base de données</w:t>
+            </w:r>
+          </w:p>
+        </w:tc>
+        <w:tc>
+          <w:tcPr/>
+          <w:p>
+            <w:pPr>
+              <w:pStyle w:val="Compact"/>
+              <w:jc w:val="left"/>
+            </w:pPr>
+            <w:r>
+              <w:t xml:space="preserve">2 au minimum</w:t>
+            </w:r>
+          </w:p>
+        </w:tc>
+        <w:tc>
+          <w:tcPr/>
+          <w:p>
+            <w:pPr>
+              <w:pStyle w:val="Compact"/>
+              <w:jc w:val="left"/>
+            </w:pPr>
+            <w:r>
+              <w:t xml:space="preserve">2 au minimum</w:t>
+            </w:r>
+          </w:p>
+        </w:tc>
+        <w:tc>
+          <w:tcPr/>
+          <w:p>
+            <w:pPr>
+              <w:pStyle w:val="Compact"/>
+              <w:jc w:val="left"/>
+            </w:pPr>
+            <w:r>
+              <w:t xml:space="preserve">—</w:t>
+            </w:r>
+          </w:p>
+        </w:tc>
+      </w:tr>
+      <w:tr>
+        <w:tc>
+          <w:tcPr/>
+          <w:p>
+            <w:pPr>
+              <w:pStyle w:val="Compact"/>
+              <w:jc w:val="left"/>
+            </w:pPr>
+            <w:r>
+              <w:t xml:space="preserve">Stockage objet</w:t>
+            </w:r>
+          </w:p>
+        </w:tc>
+        <w:tc>
+          <w:tcPr/>
+          <w:p>
+            <w:pPr>
+              <w:pStyle w:val="Compact"/>
+              <w:jc w:val="left"/>
+            </w:pPr>
+            <w:r>
+              <w:t xml:space="preserve">4 nœuds au minimum</w:t>
+            </w:r>
+          </w:p>
+        </w:tc>
+        <w:tc>
+          <w:tcPr/>
+          <w:p>
+            <w:pPr>
+              <w:pStyle w:val="Compact"/>
+              <w:jc w:val="left"/>
+            </w:pPr>
+            <w:r>
+              <w:t xml:space="preserve">4 nœuds au minimum</w:t>
+            </w:r>
+          </w:p>
+        </w:tc>
+        <w:tc>
+          <w:tcPr/>
+          <w:p>
+            <w:pPr>
+              <w:pStyle w:val="Compact"/>
+              <w:jc w:val="left"/>
+            </w:pPr>
+            <w:r>
+              <w:t xml:space="preserve">Stockage immuable</w:t>
+            </w:r>
+          </w:p>
+        </w:tc>
+      </w:tr>
+      <w:tr>
+        <w:tc>
+          <w:tcPr/>
+          <w:p>
+            <w:pPr>
+              <w:pStyle w:val="Compact"/>
+              <w:jc w:val="left"/>
+            </w:pPr>
+            <w:r>
+              <w:t xml:space="preserve">HSM</w:t>
+            </w:r>
+          </w:p>
+        </w:tc>
+        <w:tc>
+          <w:tcPr/>
+          <w:p>
+            <w:pPr>
+              <w:pStyle w:val="Compact"/>
+              <w:jc w:val="left"/>
+            </w:pPr>
+            <w:r>
+              <w:t xml:space="preserve">2</w:t>
+            </w:r>
+          </w:p>
+        </w:tc>
+        <w:tc>
+          <w:tcPr/>
+          <w:p>
+            <w:pPr>
+              <w:pStyle w:val="Compact"/>
+              <w:jc w:val="left"/>
+            </w:pPr>
+            <w:r>
+              <w:t xml:space="preserve">2</w:t>
+            </w:r>
+          </w:p>
+        </w:tc>
+        <w:tc>
+          <w:tcPr/>
+          <w:p>
+            <w:pPr>
+              <w:pStyle w:val="Compact"/>
+              <w:jc w:val="left"/>
+            </w:pPr>
+            <w:r>
+              <w:t xml:space="preserve">Sauvegarde des clés en coffre</w:t>
+            </w:r>
+          </w:p>
+        </w:tc>
+      </w:tr>
+      <w:tr>
+        <w:tc>
+          <w:tcPr/>
+          <w:p>
+            <w:pPr>
+              <w:pStyle w:val="Compact"/>
+              <w:jc w:val="left"/>
+            </w:pPr>
+            <w:r>
+              <w:t xml:space="preserve">Sauvegarde</w:t>
+            </w:r>
+          </w:p>
+        </w:tc>
+        <w:tc>
+          <w:tcPr/>
+          <w:p>
+            <w:pPr>
+              <w:pStyle w:val="Compact"/>
+              <w:jc w:val="left"/>
+            </w:pPr>
+            <w:r>
+              <w:t xml:space="preserve">Serveur de sauvegarde</w:t>
+            </w:r>
+          </w:p>
+        </w:tc>
+        <w:tc>
+          <w:tcPr/>
+          <w:p>
+            <w:pPr>
+              <w:pStyle w:val="Compact"/>
+              <w:jc w:val="left"/>
+            </w:pPr>
+            <w:r>
+              <w:t xml:space="preserve">Serveur de sauvegarde</w:t>
+            </w:r>
+          </w:p>
+        </w:tc>
+        <w:tc>
+          <w:tcPr/>
+          <w:p>
+            <w:pPr>
+              <w:pStyle w:val="Compact"/>
+              <w:jc w:val="left"/>
+            </w:pPr>
+            <w:r>
+              <w:t xml:space="preserve">Appliance immuable, bandes ou disques hors ligne</w:t>
+            </w:r>
+          </w:p>
+        </w:tc>
+      </w:tr>
+      <w:tr>
+        <w:tc>
+          <w:tcPr/>
+          <w:p>
+            <w:pPr>
+              <w:pStyle w:val="Compact"/>
+              <w:jc w:val="left"/>
+            </w:pPr>
+            <w:r>
+              <w:t xml:space="preserve">Bastions et collecteurs de supervision</w:t>
+            </w:r>
+          </w:p>
+        </w:tc>
+        <w:tc>
+          <w:tcPr/>
+          <w:p>
+            <w:pPr>
+              <w:pStyle w:val="Compact"/>
+              <w:jc w:val="left"/>
+            </w:pPr>
+            <w:r>
+              <w:t xml:space="preserve">2</w:t>
+            </w:r>
+          </w:p>
+        </w:tc>
+        <w:tc>
+          <w:tcPr/>
+          <w:p>
+            <w:pPr>
+              <w:pStyle w:val="Compact"/>
+              <w:jc w:val="left"/>
+            </w:pPr>
+            <w:r>
+              <w:t xml:space="preserve">2</w:t>
+            </w:r>
+          </w:p>
+        </w:tc>
+        <w:tc>
+          <w:tcPr/>
+          <w:p>
+            <w:pPr>
+              <w:pStyle w:val="Compact"/>
+              <w:jc w:val="left"/>
+            </w:pPr>
+            <w:r>
+              <w:t xml:space="preserve">—</w:t>
+            </w:r>
+          </w:p>
+        </w:tc>
+      </w:tr>
+    </w:tbl>
+    <w:bookmarkEnd w:id="33"/>
+    <w:bookmarkStart w:id="34" w:name="alimentation-électrique-recommandation"/>
     <w:p>
       <w:pPr>
         <w:pStyle w:val="Heading3"/>
@@ -4121,9 +5362,9 @@
         <w:t xml:space="preserve">dont l'autonomie est dimensionnée selon la fréquence et la durée des coupures observées sur le site, et, pour les postes isolés, par un groupe électrogène. Le passage sur batterie doit permettre de terminer les contrôles en cours et d'éteindre proprement les équipements.</w:t>
       </w:r>
     </w:p>
-    <w:bookmarkEnd w:id="32"/>
-    <w:bookmarkEnd w:id="33"/>
-    <w:bookmarkStart w:id="39" w:name="Xfa39e0938c0825dc65cc1096a59a74b79eaa69c"/>
+    <w:bookmarkEnd w:id="34"/>
+    <w:bookmarkEnd w:id="35"/>
+    <w:bookmarkStart w:id="41" w:name="Xfa39e0938c0825dc65cc1096a59a74b79eaa69c"/>
     <w:p>
       <w:pPr>
         <w:pStyle w:val="Heading2"/>
@@ -4132,7 +5373,7 @@
         <w:t xml:space="preserve">Installation d'un poste de travail guichet</w:t>
       </w:r>
     </w:p>
-    <w:bookmarkStart w:id="34" w:name="Xccf4a8352f608c4a7c0c42a2b44e81dfc95cd92"/>
+    <w:bookmarkStart w:id="36" w:name="Xccf4a8352f608c4a7c0c42a2b44e81dfc95cd92"/>
     <w:p>
       <w:pPr>
         <w:pStyle w:val="Heading3"/>
@@ -4205,8 +5446,8 @@
         <w:t xml:space="preserve">(nécessaire au pont NFC).</w:t>
       </w:r>
     </w:p>
-    <w:bookmarkEnd w:id="34"/>
-    <w:bookmarkStart w:id="36" w:name="X9c19df07d4c4e602f5f375ce77c958a7bd6c179"/>
+    <w:bookmarkEnd w:id="36"/>
+    <w:bookmarkStart w:id="38" w:name="X9c19df07d4c4e602f5f375ce77c958a7bd6c179"/>
     <w:p>
       <w:pPr>
         <w:pStyle w:val="Heading3"/>
@@ -4538,7 +5779,7 @@
       <w:r>
         <w:t xml:space="preserve"> </w:t>
       </w:r>
-      <w:hyperlink r:id="rId35">
+      <w:hyperlink r:id="rId37">
         <w:r>
           <w:rPr>
             <w:rStyle w:val="Hyperlink"/>
@@ -4720,8 +5961,8 @@
         <w:t xml:space="preserve">.</w:t>
       </w:r>
     </w:p>
-    <w:bookmarkEnd w:id="36"/>
-    <w:bookmarkStart w:id="37" w:name="Xeb9f5ecdf98d930efcf8f7d8001943a738ca717"/>
+    <w:bookmarkEnd w:id="38"/>
+    <w:bookmarkStart w:id="39" w:name="Xeb9f5ecdf98d930efcf8f7d8001943a738ca717"/>
     <w:p>
       <w:pPr>
         <w:pStyle w:val="Heading3"/>
@@ -4888,8 +6129,8 @@
         <w:t xml:space="preserve">Déconnectez le compte administrateur ; l'agent se connecte ensuite avec son propre compte.</w:t>
       </w:r>
     </w:p>
-    <w:bookmarkEnd w:id="37"/>
-    <w:bookmarkStart w:id="38" w:name="X2b32100c5bb1d3d30626b077c5aedcc93bc9ef8"/>
+    <w:bookmarkEnd w:id="39"/>
+    <w:bookmarkStart w:id="40" w:name="X2b32100c5bb1d3d30626b077c5aedcc93bc9ef8"/>
     <w:p>
       <w:pPr>
         <w:pStyle w:val="Heading3"/>
@@ -5003,9 +6244,9 @@
         <w:t xml:space="preserve">Lancez les vérifications sans valider la décision, ou validez sur un environnement de recette uniquement.</w:t>
       </w:r>
     </w:p>
-    <w:bookmarkEnd w:id="38"/>
-    <w:bookmarkEnd w:id="39"/>
-    <w:bookmarkStart w:id="40" w:name="installation-dun-kiosque-egate"/>
+    <w:bookmarkEnd w:id="40"/>
+    <w:bookmarkEnd w:id="41"/>
+    <w:bookmarkStart w:id="42" w:name="installation-dun-kiosque-egate"/>
     <w:p>
       <w:pPr>
         <w:pStyle w:val="Heading2"/>
@@ -5405,8 +6646,8 @@
         <w:t xml:space="preserve">.</w:t>
       </w:r>
     </w:p>
-    <w:bookmarkEnd w:id="40"/>
-    <w:bookmarkStart w:id="41" w:name="installation-de-lespace-dpaf"/>
+    <w:bookmarkEnd w:id="42"/>
+    <w:bookmarkStart w:id="43" w:name="installation-de-lespace-dpaf"/>
     <w:p>
       <w:pPr>
         <w:pStyle w:val="Heading2"/>
@@ -5516,8 +6757,8 @@
         <w:t xml:space="preserve">Pour les agents du Trésor, prévoyez un accès depuis les locaux de la DGCPT selon la politique de sécurité retenue.</w:t>
       </w:r>
     </w:p>
-    <w:bookmarkEnd w:id="41"/>
-    <w:bookmarkStart w:id="48" w:name="installation-logicielle-de-la-plateforme"/>
+    <w:bookmarkEnd w:id="43"/>
+    <w:bookmarkStart w:id="50" w:name="installation-logicielle-de-la-plateforme"/>
     <w:p>
       <w:pPr>
         <w:pStyle w:val="Heading2"/>
@@ -5526,7 +6767,7 @@
         <w:t xml:space="preserve">Installation logicielle de la plateforme</w:t>
       </w:r>
     </w:p>
-    <w:bookmarkStart w:id="42" w:name="prérequis"/>
+    <w:bookmarkStart w:id="44" w:name="prérequis"/>
     <w:p>
       <w:pPr>
         <w:pStyle w:val="Heading3"/>
@@ -5590,8 +6831,8 @@
         <w:t xml:space="preserve">Pour le démonstrateur : un compte Netlify. Aucune base de données n'est nécessaire.</w:t>
       </w:r>
     </w:p>
-    <w:bookmarkEnd w:id="42"/>
-    <w:bookmarkStart w:id="43" w:name="installation-et-tests-en-local"/>
+    <w:bookmarkEnd w:id="44"/>
+    <w:bookmarkStart w:id="45" w:name="installation-et-tests-en-local"/>
     <w:p>
       <w:pPr>
         <w:pStyle w:val="Heading3"/>
@@ -5810,8 +7051,8 @@
         <w:t xml:space="preserve">). Ces valeurs par défaut n'existent pas sur Netlify.</w:t>
       </w:r>
     </w:p>
-    <w:bookmarkEnd w:id="43"/>
-    <w:bookmarkStart w:id="44" w:name="déploiement-sur-netlify-démonstrateur"/>
+    <w:bookmarkEnd w:id="45"/>
+    <w:bookmarkStart w:id="46" w:name="déploiement-sur-netlify-démonstrateur"/>
     <w:p>
       <w:pPr>
         <w:pStyle w:val="Heading3"/>
@@ -6032,8 +7273,8 @@
         <w:t xml:space="preserve">Un test en échec bloque le déploiement.</w:t>
       </w:r>
     </w:p>
-    <w:bookmarkEnd w:id="44"/>
-    <w:bookmarkStart w:id="45" w:name="variables-denvironnement"/>
+    <w:bookmarkEnd w:id="46"/>
+    <w:bookmarkStart w:id="47" w:name="variables-denvironnement"/>
     <w:p>
       <w:pPr>
         <w:pStyle w:val="Heading3"/>
@@ -6163,7 +7404,7 @@
               <w:jc w:val="left"/>
             </w:pPr>
             <w:r>
-              <w:t xml:space="preserve">Signature des sessions et des QR codes e-Visa / WawPass. Sans elle, l'API répond par une erreur.</w:t>
+              <w:t xml:space="preserve">Signature des sessions et des QR codes e-Visa (et des anciens reçus WawPass). Sans elle, l'API répond par une erreur.</w:t>
             </w:r>
           </w:p>
         </w:tc>
@@ -6894,8 +8135,8 @@
         <w:t xml:space="preserve">; redéployez après chaque modification.</w:t>
       </w:r>
     </w:p>
-    <w:bookmarkEnd w:id="45"/>
-    <w:bookmarkStart w:id="46" w:name="gestion-des-secrets"/>
+    <w:bookmarkEnd w:id="47"/>
+    <w:bookmarkStart w:id="48" w:name="gestion-des-secrets"/>
     <w:p>
       <w:pPr>
         <w:pStyle w:val="Heading3"/>
@@ -7025,7 +8266,7 @@
           <w:bCs/>
           <w:b/>
         </w:rPr>
-        <w:t xml:space="preserve">invalide tous les QR codes e-Visa et WawPass déjà émis</w:t>
+        <w:t xml:space="preserve">invalide tous les QR codes e-Visa (et anciens reçus WawPass) déjà émis</w:t>
       </w:r>
       <w:r>
         <w:t xml:space="preserve"> </w:t>
@@ -7046,8 +8287,8 @@
         <w:t xml:space="preserve">En production nationale, les clés sont conservées dans un HSM (À développer).</w:t>
       </w:r>
     </w:p>
-    <w:bookmarkEnd w:id="46"/>
-    <w:bookmarkStart w:id="47" w:name="comptes-initiaux-et-mots-de-passe"/>
+    <w:bookmarkEnd w:id="48"/>
+    <w:bookmarkStart w:id="49" w:name="comptes-initiaux-et-mots-de-passe"/>
     <w:p>
       <w:pPr>
         <w:pStyle w:val="Heading3"/>
@@ -7233,9 +8474,9 @@
         <w:t xml:space="preserve">Les utilisateurs ne peuvent pas changer eux-mêmes leur mot de passe dans cette version : les changements passent par un administrateur.</w:t>
       </w:r>
     </w:p>
-    <w:bookmarkEnd w:id="47"/>
-    <w:bookmarkEnd w:id="48"/>
-    <w:bookmarkStart w:id="54" w:name="applications-mobiles"/>
+    <w:bookmarkEnd w:id="49"/>
+    <w:bookmarkEnd w:id="50"/>
+    <w:bookmarkStart w:id="56" w:name="applications-mobiles"/>
     <w:p>
       <w:pPr>
         <w:pStyle w:val="Heading2"/>
@@ -7506,7 +8747,7 @@
         <w:t xml:space="preserve">Avant toute diffusion au public pour le Sénégal, l'adresse de l'API doit pointer vers la plateforme nationale.</w:t>
       </w:r>
     </w:p>
-    <w:bookmarkStart w:id="49" w:name="publication-automatisée"/>
+    <w:bookmarkStart w:id="51" w:name="publication-automatisée"/>
     <w:p>
       <w:pPr>
         <w:pStyle w:val="Heading3"/>
@@ -7764,8 +9005,8 @@
         </w:tc>
       </w:tr>
     </w:tbl>
-    <w:bookmarkEnd w:id="49"/>
-    <w:bookmarkStart w:id="50" w:name="installer-lapplication-sur-iphone"/>
+    <w:bookmarkEnd w:id="51"/>
+    <w:bookmarkStart w:id="52" w:name="installer-lapplication-sur-iphone"/>
     <w:p>
       <w:pPr>
         <w:pStyle w:val="Heading3"/>
@@ -7859,8 +9100,8 @@
         <w:t xml:space="preserve">Le NFC ne fonctionne que sur un iPhone réel.</w:t>
       </w:r>
     </w:p>
-    <w:bookmarkEnd w:id="50"/>
-    <w:bookmarkStart w:id="51" w:name="installer-lapplication-sur-android"/>
+    <w:bookmarkEnd w:id="52"/>
+    <w:bookmarkStart w:id="53" w:name="installer-lapplication-sur-android"/>
     <w:p>
       <w:pPr>
         <w:pStyle w:val="Heading3"/>
@@ -7963,8 +9204,8 @@
         <w:t xml:space="preserve">dans les réglages du téléphone.</w:t>
       </w:r>
     </w:p>
-    <w:bookmarkEnd w:id="51"/>
-    <w:bookmarkStart w:id="52" w:name="conseils-nfc-à-transmettre-aux-testeurs"/>
+    <w:bookmarkEnd w:id="53"/>
+    <w:bookmarkStart w:id="54" w:name="conseils-nfc-à-transmettre-aux-testeurs"/>
     <w:p>
       <w:pPr>
         <w:pStyle w:val="Heading3"/>
@@ -8009,8 +9250,8 @@
         <w:t xml:space="preserve">Ne plus bouger pendant la lecture ; si elle échoue, vérifier la MRZ (une seule erreur empêche l'ouverture de la puce).</w:t>
       </w:r>
     </w:p>
-    <w:bookmarkEnd w:id="52"/>
-    <w:bookmarkStart w:id="53" w:name="compte-développeur"/>
+    <w:bookmarkEnd w:id="54"/>
+    <w:bookmarkStart w:id="55" w:name="compte-développeur"/>
     <w:p>
       <w:pPr>
         <w:pStyle w:val="Heading3"/>
@@ -8084,9 +9325,9 @@
         <w:t xml:space="preserve">: la vérification de la signature de la puce contre les certificats CSCA (ICAO PKD) dans l'application Flutter, ainsi que la liste exacte des données transmises au serveur, doivent être confirmées à la livraison de l'application.</w:t>
       </w:r>
     </w:p>
-    <w:bookmarkEnd w:id="53"/>
-    <w:bookmarkEnd w:id="54"/>
-    <w:bookmarkStart w:id="55" w:name="raccordement-des-compagnies-aériennes"/>
+    <w:bookmarkEnd w:id="55"/>
+    <w:bookmarkEnd w:id="56"/>
+    <w:bookmarkStart w:id="57" w:name="raccordement-des-compagnies-aériennes"/>
     <w:p>
       <w:pPr>
         <w:pStyle w:val="Heading2"/>
@@ -8645,8 +9886,8 @@
         <w:t xml:space="preserve">) servent de référence de format. Les messages PNRGOV (EDIFACT) passent par un convertisseur. Une clé compromise est remplacée sans délai.</w:t>
       </w:r>
     </w:p>
-    <w:bookmarkEnd w:id="55"/>
-    <w:bookmarkStart w:id="56" w:name="raccordement-du-trésor-dgcpt"/>
+    <w:bookmarkEnd w:id="57"/>
+    <w:bookmarkStart w:id="58" w:name="raccordement-du-trésor-dgcpt"/>
     <w:p>
       <w:pPr>
         <w:pStyle w:val="Heading2"/>
@@ -8866,8 +10107,8 @@
         <w:t xml:space="preserve">: dans le démonstrateur, les factures proviennent du jeu de démonstration. L'émission des factures réelles (déclarations des compagnies, taux IATA, comptage WawID) doit être réalisée avant l'exploitation.</w:t>
       </w:r>
     </w:p>
-    <w:bookmarkEnd w:id="56"/>
-    <w:bookmarkStart w:id="57" w:name="plan-de-formation-recommandation"/>
+    <w:bookmarkEnd w:id="58"/>
+    <w:bookmarkStart w:id="59" w:name="plan-de-formation-recommandation"/>
     <w:p>
       <w:pPr>
         <w:pStyle w:val="Heading2"/>
@@ -9114,7 +10355,7 @@
               <w:jc w:val="left"/>
             </w:pPr>
             <w:r>
-              <w:t xml:space="preserve">Comptes, paramètres, pont NFC, clés, sauvegardes, incidents</w:t>
+              <w:t xml:space="preserve">Comptes, paramètres, pont NFC, clés, sauvegardes, incidents, bascule et restauration</w:t>
             </w:r>
           </w:p>
         </w:tc>
@@ -9138,6 +10379,22 @@
               </w:rPr>
               <w:t xml:space="preserve">Déploiement et configuration</w:t>
             </w:r>
+            <w:r>
+              <w:t xml:space="preserve"> </w:t>
+            </w:r>
+            <w:r>
+              <w:t xml:space="preserve">;</w:t>
+            </w:r>
+            <w:r>
+              <w:t xml:space="preserve"> </w:t>
+            </w:r>
+            <w:r>
+              <w:rPr>
+                <w:iCs/>
+                <w:i/>
+              </w:rPr>
+              <w:t xml:space="preserve">Plan de déploiement — infrastructure haute disponibilité au Sénégal</w:t>
+            </w:r>
           </w:p>
         </w:tc>
       </w:tr>
@@ -9313,8 +10570,8 @@
         <w:t xml:space="preserve">formé au diagnostic de premier niveau.</w:t>
       </w:r>
     </w:p>
-    <w:bookmarkEnd w:id="57"/>
-    <w:bookmarkStart w:id="58" w:name="assistance-et-escalade-recommandation"/>
+    <w:bookmarkEnd w:id="59"/>
+    <w:bookmarkStart w:id="60" w:name="assistance-et-escalade-recommandation"/>
     <w:p>
       <w:pPr>
         <w:pStyle w:val="Heading2"/>
@@ -9435,19 +10692,19 @@
               <w:jc w:val="left"/>
             </w:pPr>
             <w:r>
-              <w:t xml:space="preserve">Support de l'exploitant</w:t>
-            </w:r>
-          </w:p>
-        </w:tc>
-        <w:tc>
-          <w:tcPr/>
-          <w:p>
-            <w:pPr>
-              <w:pStyle w:val="Compact"/>
-              <w:jc w:val="left"/>
-            </w:pPr>
-            <w:r>
-              <w:t xml:space="preserve">Comptes, paramètres, réseau, pont NFC, connecteurs, incidents applicatifs</w:t>
+              <w:t xml:space="preserve">Support de l'exploitant et centre de supervision (NOC) 24 h/24</w:t>
+            </w:r>
+          </w:p>
+        </w:tc>
+        <w:tc>
+          <w:tcPr/>
+          <w:p>
+            <w:pPr>
+              <w:pStyle w:val="Compact"/>
+              <w:jc w:val="left"/>
+            </w:pPr>
+            <w:r>
+              <w:t xml:space="preserve">Comptes, paramètres, réseau, pont NFC, connecteurs, incidents applicatifs, état des sites centraux et des liaisons</w:t>
             </w:r>
           </w:p>
         </w:tc>
@@ -9528,17 +10785,55 @@
           </w:p>
         </w:tc>
       </w:tr>
+      <w:tr>
+        <w:tc>
+          <w:tcPr/>
+          <w:p>
+            <w:pPr>
+              <w:pStyle w:val="Compact"/>
+              <w:jc w:val="left"/>
+            </w:pPr>
+            <w:r>
+              <w:t xml:space="preserve">Crise</w:t>
+            </w:r>
+          </w:p>
+        </w:tc>
+        <w:tc>
+          <w:tcPr/>
+          <w:p>
+            <w:pPr>
+              <w:pStyle w:val="Compact"/>
+              <w:jc w:val="left"/>
+            </w:pPr>
+            <w:r>
+              <w:t xml:space="preserve">Cellule de crise (exploitant, DPAF)</w:t>
+            </w:r>
+          </w:p>
+        </w:tc>
+        <w:tc>
+          <w:tcPr/>
+          <w:p>
+            <w:pPr>
+              <w:pStyle w:val="Compact"/>
+              <w:jc w:val="left"/>
+            </w:pPr>
+            <w:r>
+              <w:t xml:space="preserve">Perte d'un site central, rançongiciel, mode dégradé prolongé</w:t>
+            </w:r>
+          </w:p>
+        </w:tc>
+      </w:tr>
     </w:tbl>
     <w:p>
       <w:pPr>
         <w:pStyle w:val="BodyText"/>
       </w:pPr>
       <w:r>
-        <w:t xml:space="preserve">Les coordonnées, horaires et délais d'intervention de chaque niveau sont fixés avec la DPAF avant la mise en service et affichés dans chaque poste.</w:t>
-      </w:r>
-    </w:p>
-    <w:bookmarkEnd w:id="58"/>
-    <w:bookmarkStart w:id="59" w:name="recette"/>
+        <w:t xml:space="preserve">Les coordonnées, horaires et délais d'intervention de chaque niveau sont fixés avec la DPAF avant la mise en service et affichés dans chaque poste. Les maintenances planifiées sont annoncées à l'avance aux postes, aux compagnies et au Trésor.</w:t>
+      </w:r>
+    </w:p>
+    <w:bookmarkEnd w:id="60"/>
+    <w:bookmarkStart w:id="61" w:name="recette"/>
     <w:p>
       <w:pPr>
         <w:pStyle w:val="Heading2"/>
@@ -10069,19 +11364,7 @@
               <w:jc w:val="left"/>
             </w:pPr>
             <w:r>
-              <w:t xml:space="preserve">WawPass vérifié deux fois</w:t>
-            </w:r>
-          </w:p>
-        </w:tc>
-        <w:tc>
-          <w:tcPr/>
-          <w:p>
-            <w:pPr>
-              <w:pStyle w:val="Compact"/>
-              <w:jc w:val="left"/>
-            </w:pPr>
-            <w:r>
-              <w:t xml:space="preserve">Première vérification</w:t>
+              <w:t xml:space="preserve">Carte</w:t>
             </w:r>
             <w:r>
               <w:t xml:space="preserve"> </w:t>
@@ -10091,10 +11374,49 @@
                 <w:bCs/>
                 <w:b/>
               </w:rPr>
-              <w:t xml:space="preserve">Valide</w:t>
-            </w:r>
-            <w:r>
-              <w:t xml:space="preserve">, seconde « Reçu déjà utilisé »</w:t>
+              <w:t xml:space="preserve">Redevance de sécurité</w:t>
+            </w:r>
+            <w:r>
+              <w:t xml:space="preserve"> </w:t>
+            </w:r>
+            <w:r>
+              <w:t xml:space="preserve">du portail voyageur</w:t>
+            </w:r>
+          </w:p>
+        </w:tc>
+        <w:tc>
+          <w:tcPr/>
+          <w:p>
+            <w:pPr>
+              <w:pStyle w:val="Compact"/>
+              <w:jc w:val="left"/>
+            </w:pPr>
+            <w:r>
+              <w:t xml:space="preserve">Page d'information « Vous n'avez rien à payer », redevance incluse dans le billet ; aucun formulaire ni demande de paiement ;</w:t>
+            </w:r>
+            <w:r>
+              <w:t xml:space="preserve"> </w:t>
+            </w:r>
+            <w:r>
+              <w:rPr>
+                <w:rStyle w:val="VerbatimChar"/>
+              </w:rPr>
+              <w:t xml:space="preserve">POST /api/public/pass</w:t>
+            </w:r>
+            <w:r>
+              <w:t xml:space="preserve"> </w:t>
+            </w:r>
+            <w:r>
+              <w:t xml:space="preserve">répond</w:t>
+            </w:r>
+            <w:r>
+              <w:t xml:space="preserve"> </w:t>
+            </w:r>
+            <w:r>
+              <w:rPr>
+                <w:rStyle w:val="VerbatimChar"/>
+              </w:rPr>
+              <w:t xml:space="preserve">410</w:t>
             </w:r>
           </w:p>
         </w:tc>
@@ -10521,7 +11843,7 @@
               <w:jc w:val="left"/>
             </w:pPr>
             <w:r>
-              <w:t xml:space="preserve">16</w:t>
+              <w:t xml:space="preserve">18</w:t>
             </w:r>
           </w:p>
         </w:tc>
@@ -10545,21 +11867,21 @@
               <w:jc w:val="left"/>
             </w:pPr>
             <w:r>
-              <w:t xml:space="preserve">Contrôle poursuivi ; resynchronisation au retour de la liaison</w:t>
-            </w:r>
-          </w:p>
-        </w:tc>
-      </w:tr>
-      <w:tr>
-        <w:tc>
-          <w:tcPr/>
-          <w:p>
-            <w:pPr>
-              <w:pStyle w:val="Compact"/>
-              <w:jc w:val="left"/>
-            </w:pPr>
-            <w:r>
-              <w:t xml:space="preserve">17</w:t>
+              <w:t xml:space="preserve">Contrôle poursuivi ; resynchronisation au retour de la liaison, sans perte ni doublon</w:t>
+            </w:r>
+          </w:p>
+        </w:tc>
+      </w:tr>
+      <w:tr>
+        <w:tc>
+          <w:tcPr/>
+          <w:p>
+            <w:pPr>
+              <w:pStyle w:val="Compact"/>
+              <w:jc w:val="left"/>
+            </w:pPr>
+            <w:r>
+              <w:t xml:space="preserve">19</w:t>
             </w:r>
           </w:p>
         </w:tc>
@@ -10597,38 +11919,222 @@
               <w:jc w:val="left"/>
             </w:pPr>
             <w:r>
-              <w:t xml:space="preserve">18</w:t>
-            </w:r>
-          </w:p>
-        </w:tc>
-        <w:tc>
-          <w:tcPr/>
-          <w:p>
-            <w:pPr>
-              <w:pStyle w:val="Compact"/>
-              <w:jc w:val="left"/>
-            </w:pPr>
-            <w:r>
-              <w:t xml:space="preserve">Restauration de sauvegarde et bascule vers le site de secours</w:t>
-            </w:r>
-          </w:p>
-        </w:tc>
-        <w:tc>
-          <w:tcPr/>
-          <w:p>
-            <w:pPr>
-              <w:pStyle w:val="Compact"/>
-              <w:jc w:val="left"/>
-            </w:pPr>
-            <w:r>
-              <w:t xml:space="preserve">RPO et RTO conformes aux objectifs</w:t>
+              <w:t xml:space="preserve">20</w:t>
+            </w:r>
+          </w:p>
+        </w:tc>
+        <w:tc>
+          <w:tcPr/>
+          <w:p>
+            <w:pPr>
+              <w:pStyle w:val="Compact"/>
+              <w:jc w:val="left"/>
+            </w:pPr>
+            <w:r>
+              <w:t xml:space="preserve">Bascule du site A vers le site B, puis retour</w:t>
+            </w:r>
+          </w:p>
+        </w:tc>
+        <w:tc>
+          <w:tcPr/>
+          <w:p>
+            <w:pPr>
+              <w:pStyle w:val="Compact"/>
+              <w:jc w:val="left"/>
+            </w:pPr>
+            <w:r>
+              <w:t xml:space="preserve">RTO d'une heure au plus ; RPO conforme ;</w:t>
+            </w:r>
+            <w:r>
+              <w:t xml:space="preserve"> </w:t>
+            </w:r>
+            <w:r>
+              <w:rPr>
+                <w:bCs/>
+                <w:b/>
+              </w:rPr>
+              <w:t xml:space="preserve">Chaîne intègre</w:t>
+            </w:r>
+            <w:r>
+              <w:t xml:space="preserve"> </w:t>
+            </w:r>
+            <w:r>
+              <w:t xml:space="preserve">dans le</w:t>
+            </w:r>
+            <w:r>
+              <w:t xml:space="preserve"> </w:t>
+            </w:r>
+            <w:r>
+              <w:rPr>
+                <w:bCs/>
+                <w:b/>
+              </w:rPr>
+              <w:t xml:space="preserve">Journal d'audit</w:t>
+            </w:r>
+            <w:r>
+              <w:t xml:space="preserve"> </w:t>
+            </w:r>
+            <w:r>
+              <w:t xml:space="preserve">après bascule</w:t>
+            </w:r>
+          </w:p>
+        </w:tc>
+      </w:tr>
+      <w:tr>
+        <w:tc>
+          <w:tcPr/>
+          <w:p>
+            <w:pPr>
+              <w:pStyle w:val="Compact"/>
+              <w:jc w:val="left"/>
+            </w:pPr>
+            <w:r>
+              <w:t xml:space="preserve">21</w:t>
+            </w:r>
+          </w:p>
+        </w:tc>
+        <w:tc>
+          <w:tcPr/>
+          <w:p>
+            <w:pPr>
+              <w:pStyle w:val="Compact"/>
+              <w:jc w:val="left"/>
+            </w:pPr>
+            <w:r>
+              <w:t xml:space="preserve">Restauration complète depuis une copie du site C en préproduction</w:t>
+            </w:r>
+          </w:p>
+        </w:tc>
+        <w:tc>
+          <w:tcPr/>
+          <w:p>
+            <w:pPr>
+              <w:pStyle w:val="Compact"/>
+              <w:jc w:val="left"/>
+            </w:pPr>
+            <w:r>
+              <w:t xml:space="preserve">Restauration réussie ; durée et perte de données mesurées</w:t>
+            </w:r>
+          </w:p>
+        </w:tc>
+      </w:tr>
+      <w:tr>
+        <w:tc>
+          <w:tcPr/>
+          <w:p>
+            <w:pPr>
+              <w:pStyle w:val="Compact"/>
+              <w:jc w:val="left"/>
+            </w:pPr>
+            <w:r>
+              <w:t xml:space="preserve">22</w:t>
+            </w:r>
+          </w:p>
+        </w:tc>
+        <w:tc>
+          <w:tcPr/>
+          <w:p>
+            <w:pPr>
+              <w:pStyle w:val="Compact"/>
+              <w:jc w:val="left"/>
+            </w:pPr>
+            <w:r>
+              <w:t xml:space="preserve">Panne simulée d'un HSM</w:t>
+            </w:r>
+          </w:p>
+        </w:tc>
+        <w:tc>
+          <w:tcPr/>
+          <w:p>
+            <w:pPr>
+              <w:pStyle w:val="Compact"/>
+              <w:jc w:val="left"/>
+            </w:pPr>
+            <w:r>
+              <w:t xml:space="preserve">Aucune interruption des signatures</w:t>
+            </w:r>
+          </w:p>
+        </w:tc>
+      </w:tr>
+      <w:tr>
+        <w:tc>
+          <w:tcPr/>
+          <w:p>
+            <w:pPr>
+              <w:pStyle w:val="Compact"/>
+              <w:jc w:val="left"/>
+            </w:pPr>
+            <w:r>
+              <w:t xml:space="preserve">23</w:t>
+            </w:r>
+          </w:p>
+        </w:tc>
+        <w:tc>
+          <w:tcPr/>
+          <w:p>
+            <w:pPr>
+              <w:pStyle w:val="Compact"/>
+              <w:jc w:val="left"/>
+            </w:pPr>
+            <w:r>
+              <w:t xml:space="preserve">Test de charge</w:t>
+            </w:r>
+          </w:p>
+        </w:tc>
+        <w:tc>
+          <w:tcPr/>
+          <w:p>
+            <w:pPr>
+              <w:pStyle w:val="Compact"/>
+              <w:jc w:val="left"/>
+            </w:pPr>
+            <w:r>
+              <w:t xml:space="preserve">Pointe de 15 000 voyageurs par heure à l'AIBD tenue par un seul site central</w:t>
+            </w:r>
+          </w:p>
+        </w:tc>
+      </w:tr>
+      <w:tr>
+        <w:tc>
+          <w:tcPr/>
+          <w:p>
+            <w:pPr>
+              <w:pStyle w:val="Compact"/>
+              <w:jc w:val="left"/>
+            </w:pPr>
+            <w:r>
+              <w:t xml:space="preserve">24</w:t>
+            </w:r>
+          </w:p>
+        </w:tc>
+        <w:tc>
+          <w:tcPr/>
+          <w:p>
+            <w:pPr>
+              <w:pStyle w:val="Compact"/>
+              <w:jc w:val="left"/>
+            </w:pPr>
+            <w:r>
+              <w:t xml:space="preserve">Test d'intrusion</w:t>
+            </w:r>
+          </w:p>
+        </w:tc>
+        <w:tc>
+          <w:tcPr/>
+          <w:p>
+            <w:pPr>
+              <w:pStyle w:val="Compact"/>
+              <w:jc w:val="left"/>
+            </w:pPr>
+            <w:r>
+              <w:t xml:space="preserve">Aucune vulnérabilité critique ou élevée ouverte</w:t>
             </w:r>
           </w:p>
         </w:tc>
       </w:tr>
     </w:tbl>
-    <w:bookmarkEnd w:id="59"/>
-    <w:bookmarkStart w:id="60" w:name="liste-de-contrôle-de-mise-en-service"/>
+    <w:bookmarkEnd w:id="61"/>
+    <w:bookmarkStart w:id="62" w:name="liste-de-contrôle-de-mise-en-service"/>
     <w:p>
       <w:pPr>
         <w:pStyle w:val="Heading2"/>
@@ -10658,7 +12164,7 @@
         <w:pStyle w:val="Compact"/>
       </w:pPr>
       <w:r>
-        <w:t xml:space="preserve">Hébergement national opérationnel ; site de secours et sauvegardes testés.</w:t>
+        <w:t xml:space="preserve">Sites A et B opérationnels et conventions signées ; site C recevant les copies immuables et hors ligne ; bascule A → B, retour et restauration depuis le site C réussis.</w:t>
       </w:r>
     </w:p>
     <w:p>
@@ -10670,7 +12176,7 @@
         <w:pStyle w:val="Compact"/>
       </w:pPr>
       <w:r>
-        <w:t xml:space="preserve">Jeu de démonstration désactivé ; aucune donnée fictive dans la base de production.</w:t>
+        <w:t xml:space="preserve">Centre de supervision 24 h/24, SOC, astreinte et cellule de crise en place ; procédures de bascule et de restauration rédigées.</w:t>
       </w:r>
     </w:p>
     <w:p>
@@ -10682,70 +12188,7 @@
         <w:pStyle w:val="Compact"/>
       </w:pPr>
       <w:r>
-        <w:rPr>
-          <w:rStyle w:val="VerbatimChar"/>
-        </w:rPr>
-        <w:t xml:space="preserve">SESSION_SECRET</w:t>
-      </w:r>
-      <w:r>
-        <w:t xml:space="preserve">,</w:t>
-      </w:r>
-      <w:r>
-        <w:t xml:space="preserve"> </w:t>
-      </w:r>
-      <w:r>
-        <w:rPr>
-          <w:rStyle w:val="VerbatimChar"/>
-        </w:rPr>
-        <w:t xml:space="preserve">WAWID_ADMIN_PASSWORD</w:t>
-      </w:r>
-      <w:r>
-        <w:t xml:space="preserve">,</w:t>
-      </w:r>
-      <w:r>
-        <w:t xml:space="preserve"> </w:t>
-      </w:r>
-      <w:r>
-        <w:rPr>
-          <w:rStyle w:val="VerbatimChar"/>
-        </w:rPr>
-        <w:t xml:space="preserve">WAWID_GATE_KEY</w:t>
-      </w:r>
-      <w:r>
-        <w:t xml:space="preserve"> </w:t>
-      </w:r>
-      <w:r>
-        <w:t xml:space="preserve">et</w:t>
-      </w:r>
-      <w:r>
-        <w:t xml:space="preserve"> </w:t>
-      </w:r>
-      <w:r>
-        <w:rPr>
-          <w:rStyle w:val="VerbatimChar"/>
-        </w:rPr>
-        <w:t xml:space="preserve">WAWID_CARRIER_KEYS</w:t>
-      </w:r>
-      <w:r>
-        <w:t xml:space="preserve"> </w:t>
-      </w:r>
-      <w:r>
-        <w:t xml:space="preserve">définis ;</w:t>
-      </w:r>
-      <w:r>
-        <w:t xml:space="preserve"> </w:t>
-      </w:r>
-      <w:r>
-        <w:rPr>
-          <w:rStyle w:val="VerbatimChar"/>
-        </w:rPr>
-        <w:t xml:space="preserve">WAWID_DEMO_PASSWORD</w:t>
-      </w:r>
-      <w:r>
-        <w:t xml:space="preserve"> </w:t>
-      </w:r>
-      <w:r>
-        <w:t xml:space="preserve">absent.</w:t>
+        <w:t xml:space="preserve">Jeu de démonstration désactivé ; aucune donnée fictive dans la base de production.</w:t>
       </w:r>
     </w:p>
     <w:p>
@@ -10757,22 +12200,70 @@
         <w:pStyle w:val="Compact"/>
       </w:pPr>
       <w:r>
-        <w:t xml:space="preserve">Comptes nominatifs créés ; mot de passe du compte</w:t>
-      </w:r>
-      <w:r>
-        <w:t xml:space="preserve"> </w:t>
-      </w:r>
-      <w:r>
         <w:rPr>
           <w:rStyle w:val="VerbatimChar"/>
         </w:rPr>
-        <w:t xml:space="preserve">admin</w:t>
-      </w:r>
-      <w:r>
-        <w:t xml:space="preserve"> </w:t>
-      </w:r>
-      <w:r>
-        <w:t xml:space="preserve">changé ; revue des rôles faite.</w:t>
+        <w:t xml:space="preserve">SESSION_SECRET</w:t>
+      </w:r>
+      <w:r>
+        <w:t xml:space="preserve">,</w:t>
+      </w:r>
+      <w:r>
+        <w:t xml:space="preserve"> </w:t>
+      </w:r>
+      <w:r>
+        <w:rPr>
+          <w:rStyle w:val="VerbatimChar"/>
+        </w:rPr>
+        <w:t xml:space="preserve">WAWID_ADMIN_PASSWORD</w:t>
+      </w:r>
+      <w:r>
+        <w:t xml:space="preserve">,</w:t>
+      </w:r>
+      <w:r>
+        <w:t xml:space="preserve"> </w:t>
+      </w:r>
+      <w:r>
+        <w:rPr>
+          <w:rStyle w:val="VerbatimChar"/>
+        </w:rPr>
+        <w:t xml:space="preserve">WAWID_GATE_KEY</w:t>
+      </w:r>
+      <w:r>
+        <w:t xml:space="preserve"> </w:t>
+      </w:r>
+      <w:r>
+        <w:t xml:space="preserve">et</w:t>
+      </w:r>
+      <w:r>
+        <w:t xml:space="preserve"> </w:t>
+      </w:r>
+      <w:r>
+        <w:rPr>
+          <w:rStyle w:val="VerbatimChar"/>
+        </w:rPr>
+        <w:t xml:space="preserve">WAWID_CARRIER_KEYS</w:t>
+      </w:r>
+      <w:r>
+        <w:t xml:space="preserve"> </w:t>
+      </w:r>
+      <w:r>
+        <w:t xml:space="preserve">définis ;</w:t>
+      </w:r>
+      <w:r>
+        <w:t xml:space="preserve"> </w:t>
+      </w:r>
+      <w:r>
+        <w:rPr>
+          <w:rStyle w:val="VerbatimChar"/>
+        </w:rPr>
+        <w:t xml:space="preserve">WAWID_DEMO_PASSWORD</w:t>
+      </w:r>
+      <w:r>
+        <w:t xml:space="preserve"> </w:t>
+      </w:r>
+      <w:r>
+        <w:t xml:space="preserve">absent.</w:t>
       </w:r>
     </w:p>
     <w:p>
@@ -10784,7 +12275,7 @@
         <w:pStyle w:val="Compact"/>
       </w:pPr>
       <w:r>
-        <w:t xml:space="preserve">Ponts NFC installés avec</w:t>
+        <w:t xml:space="preserve">Comptes nominatifs créés ; mot de passe du compte</w:t>
       </w:r>
       <w:r>
         <w:t xml:space="preserve"> </w:t>
@@ -10793,29 +12284,13 @@
         <w:rPr>
           <w:rStyle w:val="VerbatimChar"/>
         </w:rPr>
-        <w:t xml:space="preserve">NFC_BRIDGE_ORIGIN</w:t>
-      </w:r>
-      <w:r>
-        <w:t xml:space="preserve"> </w:t>
-      </w:r>
-      <w:r>
-        <w:t xml:space="preserve">limité au domaine de production ; test</w:t>
-      </w:r>
-      <w:r>
-        <w:t xml:space="preserve"> </w:t>
-      </w:r>
-      <w:r>
-        <w:rPr>
-          <w:bCs/>
-          <w:b/>
-        </w:rPr>
-        <w:t xml:space="preserve">Connecté</w:t>
-      </w:r>
-      <w:r>
-        <w:t xml:space="preserve"> </w:t>
-      </w:r>
-      <w:r>
-        <w:t xml:space="preserve">sur chaque poste.</w:t>
+        <w:t xml:space="preserve">admin</w:t>
+      </w:r>
+      <w:r>
+        <w:t xml:space="preserve"> </w:t>
+      </w:r>
+      <w:r>
+        <w:t xml:space="preserve">changé ; revue des rôles faite.</w:t>
       </w:r>
     </w:p>
     <w:p>
@@ -10827,7 +12302,38 @@
         <w:pStyle w:val="Compact"/>
       </w:pPr>
       <w:r>
-        <w:t xml:space="preserve">Lecteurs, SDK biométriques et kiosques intégrés et testés ; simulateur masqué sur les kiosques.</w:t>
+        <w:t xml:space="preserve">Ponts NFC installés avec</w:t>
+      </w:r>
+      <w:r>
+        <w:t xml:space="preserve"> </w:t>
+      </w:r>
+      <w:r>
+        <w:rPr>
+          <w:rStyle w:val="VerbatimChar"/>
+        </w:rPr>
+        <w:t xml:space="preserve">NFC_BRIDGE_ORIGIN</w:t>
+      </w:r>
+      <w:r>
+        <w:t xml:space="preserve"> </w:t>
+      </w:r>
+      <w:r>
+        <w:t xml:space="preserve">limité au domaine de production ; test</w:t>
+      </w:r>
+      <w:r>
+        <w:t xml:space="preserve"> </w:t>
+      </w:r>
+      <w:r>
+        <w:rPr>
+          <w:bCs/>
+          <w:b/>
+        </w:rPr>
+        <w:t xml:space="preserve">Connecté</w:t>
+      </w:r>
+      <w:r>
+        <w:t xml:space="preserve"> </w:t>
+      </w:r>
+      <w:r>
+        <w:t xml:space="preserve">sur chaque poste.</w:t>
       </w:r>
     </w:p>
     <w:p>
@@ -10839,7 +12345,7 @@
         <w:pStyle w:val="Compact"/>
       </w:pPr>
       <w:r>
-        <w:t xml:space="preserve">Connecteurs (Interpol, WAPIS, FPR, DAF) raccordés ou, à défaut, copie locale des listes à jour et procédure validée.</w:t>
+        <w:t xml:space="preserve">Lecteurs, SDK biométriques et kiosques intégrés et testés ; simulateur masqué sur les kiosques.</w:t>
       </w:r>
     </w:p>
     <w:p>
@@ -10851,7 +12357,7 @@
         <w:pStyle w:val="Compact"/>
       </w:pPr>
       <w:r>
-        <w:t xml:space="preserve">Compagnies raccordées et testées, comptes de la plateforme des compagnies créés ; circuit de recouvrement de la redevance arrêté avec la base juridique correspondante ; agents du Trésor formés.</w:t>
+        <w:t xml:space="preserve">Connecteurs (Interpol, WAPIS, FPR, DAF) raccordés ou, à défaut, copie locale des listes à jour et procédure validée.</w:t>
       </w:r>
     </w:p>
     <w:p>
@@ -10863,7 +12369,7 @@
         <w:pStyle w:val="Compact"/>
       </w:pPr>
       <w:r>
-        <w:t xml:space="preserve">Applications mobiles pointant vers l'API nationale ; fiches des magasins validées.</w:t>
+        <w:t xml:space="preserve">Compagnies raccordées et testées, comptes de la plateforme des compagnies créés ; circuit de recouvrement de la redevance arrêté avec la base juridique correspondante ; agents du Trésor formés.</w:t>
       </w:r>
     </w:p>
     <w:p>
@@ -10875,7 +12381,7 @@
         <w:pStyle w:val="Compact"/>
       </w:pPr>
       <w:r>
-        <w:t xml:space="preserve">Procédure de mode dégradé affichée dans chaque poste ; onduleurs testés.</w:t>
+        <w:t xml:space="preserve">Applications mobiles pointant vers l'API nationale ; fiches des magasins validées.</w:t>
       </w:r>
     </w:p>
     <w:p>
@@ -10887,7 +12393,7 @@
         <w:pStyle w:val="Compact"/>
       </w:pPr>
       <w:r>
-        <w:t xml:space="preserve">Agents formés ; référents désignés ; chaîne d'escalade diffusée.</w:t>
+        <w:t xml:space="preserve">Procédure de mode dégradé affichée dans chaque poste ; serveurs de poste, liaisons de secours, onduleurs et groupes électrogènes testés.</w:t>
       </w:r>
     </w:p>
     <w:p>
@@ -10899,10 +12405,22 @@
         <w:pStyle w:val="Compact"/>
       </w:pPr>
       <w:r>
+        <w:t xml:space="preserve">Agents formés ; référents désignés ; chaîne d'escalade diffusée.</w:t>
+      </w:r>
+    </w:p>
+    <w:p>
+      <w:pPr>
+        <w:numPr>
+          <w:ilvl w:val="0"/>
+          <w:numId w:val="1020"/>
+        </w:numPr>
+        <w:pStyle w:val="Compact"/>
+      </w:pPr>
+      <w:r>
         <w:t xml:space="preserve">Recette signée ; procès-verbal de mise en service établi.</w:t>
       </w:r>
     </w:p>
-    <w:bookmarkEnd w:id="60"/>
+    <w:bookmarkEnd w:id="62"/>
     <w:sectPr/>
   </w:body>
 </w:document>

</xml_diff>